<commit_message>
Expand task-specific solution papers
</commit_message>
<xml_diff>
--- a/docs/Task_A_User_Modeling_Team_Ace.docx
+++ b/docs/Task_A_User_Modeling_Team_Ace.docx
@@ -2,9 +2,6 @@
 <file path=word/document.xml><?xml version="1.0" encoding="utf-8"?>
 <w:document xmlns:wpc="http://schemas.microsoft.com/office/word/2010/wordprocessingCanvas" xmlns:mo="http://schemas.microsoft.com/office/mac/office/2008/main" xmlns:mc="http://schemas.openxmlformats.org/markup-compatibility/2006" xmlns:mv="urn:schemas-microsoft-com:mac:vml" xmlns:o="urn:schemas-microsoft-com:office:office" xmlns:r="http://schemas.openxmlformats.org/officeDocument/2006/relationships" xmlns:m="http://schemas.openxmlformats.org/officeDocument/2006/math" xmlns:v="urn:schemas-microsoft-com:vml" xmlns:wp14="http://schemas.microsoft.com/office/word/2010/wordprocessingDrawing" xmlns:wp="http://schemas.openxmlformats.org/drawingml/2006/wordprocessingDrawing" xmlns:w10="urn:schemas-microsoft-com:office:word" xmlns:w="http://schemas.openxmlformats.org/wordprocessingml/2006/main" xmlns:w14="http://schemas.microsoft.com/office/word/2010/wordml" xmlns:wpg="http://schemas.microsoft.com/office/word/2010/wordprocessingGroup" xmlns:wpi="http://schemas.microsoft.com/office/word/2010/wordprocessingInk" xmlns:wne="http://schemas.microsoft.com/office/word/2006/wordml" xmlns:wps="http://schemas.microsoft.com/office/word/2010/wordprocessingShape" mc:Ignorable="w14 wp14">
   <w:body>
-    <w:p/>
-    <w:p/>
-    <w:p/>
     <w:p/>
     <w:p/>
     <w:p>
@@ -33,14 +30,45 @@
     </w:p>
     <w:p>
       <w:pPr>
+        <w:spacing w:after="20"/>
         <w:jc w:val="center"/>
       </w:pPr>
       <w:r>
         <w:rPr>
           <w:color w:val="000000"/>
-          <w:sz w:val="22"/>
         </w:rPr>
-        <w:t>Team Ace</w:t>
+        <w:drawing>
+          <wp:inline xmlns:a="http://schemas.openxmlformats.org/drawingml/2006/main" xmlns:pic="http://schemas.openxmlformats.org/drawingml/2006/picture">
+            <wp:extent cx="4983480" cy="2367153"/>
+            <wp:docPr id="1" name="Picture 1"/>
+            <wp:cNvGraphicFramePr>
+              <a:graphicFrameLocks noChangeAspect="1"/>
+            </wp:cNvGraphicFramePr>
+            <a:graphic>
+              <a:graphicData uri="http://schemas.openxmlformats.org/drawingml/2006/picture">
+                <pic:pic>
+                  <pic:nvPicPr>
+                    <pic:cNvPr id="0" name="cover_visual.png"/>
+                    <pic:cNvPicPr/>
+                  </pic:nvPicPr>
+                  <pic:blipFill>
+                    <a:blip r:embed="rId11"/>
+                    <a:stretch>
+                      <a:fillRect/>
+                    </a:stretch>
+                  </pic:blipFill>
+                  <pic:spPr>
+                    <a:xfrm>
+                      <a:off x="0" y="0"/>
+                      <a:ext cx="4983480" cy="2367153"/>
+                    </a:xfrm>
+                    <a:prstGeom prst="rect"/>
+                  </pic:spPr>
+                </pic:pic>
+              </a:graphicData>
+            </a:graphic>
+          </wp:inline>
+        </w:drawing>
       </w:r>
     </w:p>
     <w:p>
@@ -50,45 +78,92 @@
       <w:r>
         <w:rPr>
           <w:color w:val="000000"/>
-          <w:sz w:val="22"/>
+          <w:sz w:val="16"/>
+        </w:rPr>
+      </w:r>
+    </w:p>
+    <w:p>
+      <w:pPr>
+        <w:spacing w:after="20"/>
+        <w:jc w:val="center"/>
+      </w:pPr>
+      <w:r>
+        <w:rPr>
+          <w:b/>
+          <w:color w:val="000000"/>
+          <w:sz w:val="21"/>
+        </w:rPr>
+        <w:t>Standalone Solution Paper</w:t>
+      </w:r>
+    </w:p>
+    <w:p>
+      <w:pPr>
+        <w:spacing w:after="20"/>
+        <w:jc w:val="center"/>
+      </w:pPr>
+      <w:r>
+        <w:rPr>
+          <w:b/>
+          <w:color w:val="000000"/>
+          <w:sz w:val="21"/>
+        </w:rPr>
+        <w:t>Team Ace</w:t>
+      </w:r>
+    </w:p>
+    <w:p>
+      <w:pPr>
+        <w:spacing w:after="20"/>
+        <w:jc w:val="center"/>
+      </w:pPr>
+      <w:r>
+        <w:rPr>
+          <w:b w:val="0"/>
+          <w:color w:val="000000"/>
+          <w:sz w:val="18"/>
         </w:rPr>
         <w:t>Teslim Sadiq | Yasir Oyebo | Abiodun Mark</w:t>
       </w:r>
     </w:p>
     <w:p>
       <w:pPr>
+        <w:spacing w:after="20"/>
         <w:jc w:val="center"/>
       </w:pPr>
       <w:r>
         <w:rPr>
+          <w:b w:val="0"/>
           <w:color w:val="000000"/>
-          <w:sz w:val="22"/>
+          <w:sz w:val="18"/>
         </w:rPr>
         <w:t>Contact: sadiqadetola08@gmail.com</w:t>
       </w:r>
     </w:p>
     <w:p>
       <w:pPr>
+        <w:spacing w:after="20"/>
         <w:jc w:val="center"/>
       </w:pPr>
       <w:r>
         <w:rPr>
+          <w:b w:val="0"/>
           <w:color w:val="000000"/>
-          <w:sz w:val="22"/>
+          <w:sz w:val="18"/>
         </w:rPr>
         <w:t>Data &amp; AI Summit Hackathon 3.0</w:t>
       </w:r>
     </w:p>
     <w:p>
       <w:pPr>
+        <w:spacing w:after="20"/>
         <w:jc w:val="center"/>
       </w:pPr>
       <w:r>
         <w:rPr>
+          <w:b w:val="0"/>
           <w:color w:val="000000"/>
-          <w:sz w:val="22"/>
+          <w:sz w:val="18"/>
         </w:rPr>
-        <w:t>May 2026</w:t>
+        <w:t>DSN x BCT LLM Agent Challenge | May 2026</w:t>
       </w:r>
     </w:p>
     <w:p>
@@ -115,7 +190,15 @@
         <w:rPr>
           <w:color w:val="000000"/>
         </w:rPr>
-        <w:t>Task A asks the system to understand a user deeply enough to simulate how they would rate and review an unseen item. Team Ace solves this with a dynamic behavioral persona: a shared memory object containing rating bias, category affinity, likes, dislikes, tone, budget pressure, location, language preference, and review history.</w:t>
+        <w:t>Task A is about behavioral fidelity: given a user persona and an unseen product, the system must predict the rating the user would give and write a review that sounds consistent with their preferences, tone, history, and context. Team Ace solves this by treating the user as a dynamic behavioral persona rather than a static profile label.</w:t>
+      </w:r>
+    </w:p>
+    <w:p>
+      <w:r>
+        <w:rPr>
+          <w:color w:val="000000"/>
+        </w:rPr>
+        <w:t>The core design separates decision-making from language generation. A local, interpretable rating model predicts the star score first. Retrieval then provides grounding evidence from the user's history. Groq is only used after the rating decision to produce fluent review text. If Groq is unavailable, a deterministic fallback still returns a complete review response.</w:t>
       </w:r>
     </w:p>
     <w:tbl>
@@ -126,20 +209,20 @@
         <w:tblLook w:firstColumn="1" w:firstRow="1" w:lastColumn="0" w:lastRow="0" w:noHBand="0" w:noVBand="1" w:val="04A0"/>
       </w:tblPr>
       <w:tblGrid>
-        <w:gridCol w:w="3360"/>
-        <w:gridCol w:w="3360"/>
-        <w:gridCol w:w="3360"/>
+        <w:gridCol w:w="3389"/>
+        <w:gridCol w:w="3389"/>
+        <w:gridCol w:w="3389"/>
       </w:tblGrid>
       <w:tr>
         <w:tc>
           <w:tcPr>
-            <w:tcW w:type="dxa" w:w="2160"/>
+            <w:tcW w:type="dxa" w:w="1944"/>
             <w:shd w:fill="E6E6E6"/>
             <w:tcMar>
-              <w:top w:w="70" w:type="dxa"/>
-              <w:start w:w="100" w:type="dxa"/>
-              <w:bottom w:w="70" w:type="dxa"/>
-              <w:end w:w="100" w:type="dxa"/>
+              <w:top w:w="60" w:type="dxa"/>
+              <w:start w:w="95" w:type="dxa"/>
+              <w:bottom w:w="60" w:type="dxa"/>
+              <w:end w:w="95" w:type="dxa"/>
             </w:tcMar>
             <w:vAlign w:val="center"/>
           </w:tcPr>
@@ -149,7 +232,7 @@
                 <w:b/>
                 <w:color w:val="000000"/>
               </w:rPr>
-              <w:t>Input</w:t>
+              <w:t>Requirement</w:t>
             </w:r>
           </w:p>
         </w:tc>
@@ -158,10 +241,10 @@
             <w:tcW w:type="dxa" w:w="4752"/>
             <w:shd w:fill="E6E6E6"/>
             <w:tcMar>
-              <w:top w:w="70" w:type="dxa"/>
-              <w:start w:w="100" w:type="dxa"/>
-              <w:bottom w:w="70" w:type="dxa"/>
-              <w:end w:w="100" w:type="dxa"/>
+              <w:top w:w="60" w:type="dxa"/>
+              <w:start w:w="95" w:type="dxa"/>
+              <w:bottom w:w="60" w:type="dxa"/>
+              <w:end w:w="95" w:type="dxa"/>
             </w:tcMar>
             <w:vAlign w:val="center"/>
           </w:tcPr>
@@ -171,19 +254,19 @@
                 <w:b/>
                 <w:color w:val="000000"/>
               </w:rPr>
-              <w:t>Agent Decision</w:t>
+              <w:t>Team Ace Implementation</w:t>
             </w:r>
           </w:p>
         </w:tc>
         <w:tc>
           <w:tcPr>
-            <w:tcW w:type="dxa" w:w="2448"/>
+            <w:tcW w:type="dxa" w:w="2520"/>
             <w:shd w:fill="E6E6E6"/>
             <w:tcMar>
-              <w:top w:w="70" w:type="dxa"/>
-              <w:start w:w="100" w:type="dxa"/>
-              <w:bottom w:w="70" w:type="dxa"/>
-              <w:end w:w="100" w:type="dxa"/>
+              <w:top w:w="60" w:type="dxa"/>
+              <w:start w:w="95" w:type="dxa"/>
+              <w:bottom w:w="60" w:type="dxa"/>
+              <w:end w:w="95" w:type="dxa"/>
             </w:tcMar>
             <w:vAlign w:val="center"/>
           </w:tcPr>
@@ -193,7 +276,7 @@
                 <w:b/>
                 <w:color w:val="000000"/>
               </w:rPr>
-              <w:t>Output</w:t>
+              <w:t>Judge Evidence</w:t>
             </w:r>
           </w:p>
         </w:tc>
@@ -201,12 +284,12 @@
       <w:tr>
         <w:tc>
           <w:tcPr>
-            <w:tcW w:type="dxa" w:w="2160"/>
+            <w:tcW w:type="dxa" w:w="1944"/>
             <w:tcMar>
-              <w:top w:w="70" w:type="dxa"/>
-              <w:start w:w="100" w:type="dxa"/>
-              <w:bottom w:w="70" w:type="dxa"/>
-              <w:end w:w="100" w:type="dxa"/>
+              <w:top w:w="60" w:type="dxa"/>
+              <w:start w:w="95" w:type="dxa"/>
+              <w:bottom w:w="60" w:type="dxa"/>
+              <w:end w:w="95" w:type="dxa"/>
             </w:tcMar>
             <w:vAlign w:val="center"/>
           </w:tcPr>
@@ -215,7 +298,7 @@
               <w:rPr>
                 <w:color w:val="000000"/>
               </w:rPr>
-              <w:t>User persona</w:t>
+              <w:t>Star rating</w:t>
             </w:r>
           </w:p>
         </w:tc>
@@ -223,10 +306,10 @@
           <w:tcPr>
             <w:tcW w:type="dxa" w:w="4752"/>
             <w:tcMar>
-              <w:top w:w="70" w:type="dxa"/>
-              <w:start w:w="100" w:type="dxa"/>
-              <w:bottom w:w="70" w:type="dxa"/>
-              <w:end w:w="100" w:type="dxa"/>
+              <w:top w:w="60" w:type="dxa"/>
+              <w:start w:w="95" w:type="dxa"/>
+              <w:bottom w:w="60" w:type="dxa"/>
+              <w:end w:w="95" w:type="dxa"/>
             </w:tcMar>
             <w:vAlign w:val="center"/>
           </w:tcPr>
@@ -235,18 +318,18 @@
               <w:rPr>
                 <w:color w:val="000000"/>
               </w:rPr>
-              <w:t>Estimate rating bias, tone, preferences, dislikes, and contextual constraints</w:t>
+              <w:t>Local rating ensemble using user bias, product signal, category affinity, preference match, and budget pressure</w:t>
             </w:r>
           </w:p>
         </w:tc>
         <w:tc>
           <w:tcPr>
-            <w:tcW w:type="dxa" w:w="2448"/>
+            <w:tcW w:type="dxa" w:w="2520"/>
             <w:tcMar>
-              <w:top w:w="70" w:type="dxa"/>
-              <w:start w:w="100" w:type="dxa"/>
-              <w:bottom w:w="70" w:type="dxa"/>
-              <w:end w:w="100" w:type="dxa"/>
+              <w:top w:w="60" w:type="dxa"/>
+              <w:start w:w="95" w:type="dxa"/>
+              <w:bottom w:w="60" w:type="dxa"/>
+              <w:end w:w="95" w:type="dxa"/>
             </w:tcMar>
             <w:vAlign w:val="center"/>
           </w:tcPr>
@@ -255,7 +338,7 @@
               <w:rPr>
                 <w:color w:val="000000"/>
               </w:rPr>
-              <w:t>Behavioral profile</w:t>
+              <w:t>rating, confidence, reasoning</w:t>
             </w:r>
           </w:p>
         </w:tc>
@@ -263,12 +346,12 @@
       <w:tr>
         <w:tc>
           <w:tcPr>
-            <w:tcW w:type="dxa" w:w="2160"/>
+            <w:tcW w:type="dxa" w:w="1944"/>
             <w:tcMar>
-              <w:top w:w="70" w:type="dxa"/>
-              <w:start w:w="100" w:type="dxa"/>
-              <w:bottom w:w="70" w:type="dxa"/>
-              <w:end w:w="100" w:type="dxa"/>
+              <w:top w:w="60" w:type="dxa"/>
+              <w:start w:w="95" w:type="dxa"/>
+              <w:bottom w:w="60" w:type="dxa"/>
+              <w:end w:w="95" w:type="dxa"/>
             </w:tcMar>
             <w:vAlign w:val="center"/>
           </w:tcPr>
@@ -277,7 +360,7 @@
               <w:rPr>
                 <w:color w:val="000000"/>
               </w:rPr>
-              <w:t>Product details</w:t>
+              <w:t>Written review</w:t>
             </w:r>
           </w:p>
         </w:tc>
@@ -285,10 +368,10 @@
           <w:tcPr>
             <w:tcW w:type="dxa" w:w="4752"/>
             <w:tcMar>
-              <w:top w:w="70" w:type="dxa"/>
-              <w:start w:w="100" w:type="dxa"/>
-              <w:bottom w:w="70" w:type="dxa"/>
-              <w:end w:w="100" w:type="dxa"/>
+              <w:top w:w="60" w:type="dxa"/>
+              <w:start w:w="95" w:type="dxa"/>
+              <w:bottom w:w="60" w:type="dxa"/>
+              <w:end w:w="95" w:type="dxa"/>
             </w:tcMar>
             <w:vAlign w:val="center"/>
           </w:tcPr>
@@ -297,18 +380,18 @@
               <w:rPr>
                 <w:color w:val="000000"/>
               </w:rPr>
-              <w:t>Compare category, metadata, price, and text against persona memory</w:t>
+              <w:t>Retrieval-augmented Groq prompt with deterministic fallback</w:t>
             </w:r>
           </w:p>
         </w:tc>
         <w:tc>
           <w:tcPr>
-            <w:tcW w:type="dxa" w:w="2448"/>
+            <w:tcW w:type="dxa" w:w="2520"/>
             <w:tcMar>
-              <w:top w:w="70" w:type="dxa"/>
-              <w:start w:w="100" w:type="dxa"/>
-              <w:bottom w:w="70" w:type="dxa"/>
-              <w:end w:w="100" w:type="dxa"/>
+              <w:top w:w="60" w:type="dxa"/>
+              <w:start w:w="95" w:type="dxa"/>
+              <w:bottom w:w="60" w:type="dxa"/>
+              <w:end w:w="95" w:type="dxa"/>
             </w:tcMar>
             <w:vAlign w:val="center"/>
           </w:tcPr>
@@ -317,7 +400,7 @@
               <w:rPr>
                 <w:color w:val="000000"/>
               </w:rPr>
-              <w:t>Predicted star rating</w:t>
+              <w:t>review_text and fallback_used</w:t>
             </w:r>
           </w:p>
         </w:tc>
@@ -325,12 +408,12 @@
       <w:tr>
         <w:tc>
           <w:tcPr>
-            <w:tcW w:type="dxa" w:w="2160"/>
+            <w:tcW w:type="dxa" w:w="1944"/>
             <w:tcMar>
-              <w:top w:w="70" w:type="dxa"/>
-              <w:start w:w="100" w:type="dxa"/>
-              <w:bottom w:w="70" w:type="dxa"/>
-              <w:end w:w="100" w:type="dxa"/>
+              <w:top w:w="60" w:type="dxa"/>
+              <w:start w:w="95" w:type="dxa"/>
+              <w:bottom w:w="60" w:type="dxa"/>
+              <w:end w:w="95" w:type="dxa"/>
             </w:tcMar>
             <w:vAlign w:val="center"/>
           </w:tcPr>
@@ -339,7 +422,7 @@
               <w:rPr>
                 <w:color w:val="000000"/>
               </w:rPr>
-              <w:t>Evidence history</w:t>
+              <w:t>Behavioral fidelity</w:t>
             </w:r>
           </w:p>
         </w:tc>
@@ -347,10 +430,10 @@
           <w:tcPr>
             <w:tcW w:type="dxa" w:w="4752"/>
             <w:tcMar>
-              <w:top w:w="70" w:type="dxa"/>
-              <w:start w:w="100" w:type="dxa"/>
-              <w:bottom w:w="70" w:type="dxa"/>
-              <w:end w:w="100" w:type="dxa"/>
+              <w:top w:w="60" w:type="dxa"/>
+              <w:start w:w="95" w:type="dxa"/>
+              <w:bottom w:w="60" w:type="dxa"/>
+              <w:end w:w="95" w:type="dxa"/>
             </w:tcMar>
             <w:vAlign w:val="center"/>
           </w:tcPr>
@@ -359,18 +442,18 @@
               <w:rPr>
                 <w:color w:val="000000"/>
               </w:rPr>
-              <w:t>Retrieve similar prior interactions and tone examples</w:t>
+              <w:t>Persona memory includes history, tone, likes, dislikes, Nigerian context, and language preference</w:t>
             </w:r>
           </w:p>
         </w:tc>
         <w:tc>
           <w:tcPr>
-            <w:tcW w:type="dxa" w:w="2448"/>
+            <w:tcW w:type="dxa" w:w="2520"/>
             <w:tcMar>
-              <w:top w:w="70" w:type="dxa"/>
-              <w:start w:w="100" w:type="dxa"/>
-              <w:bottom w:w="70" w:type="dxa"/>
-              <w:end w:w="100" w:type="dxa"/>
+              <w:top w:w="60" w:type="dxa"/>
+              <w:start w:w="95" w:type="dxa"/>
+              <w:bottom w:w="60" w:type="dxa"/>
+              <w:end w:w="95" w:type="dxa"/>
             </w:tcMar>
             <w:vAlign w:val="center"/>
           </w:tcPr>
@@ -379,7 +462,69 @@
               <w:rPr>
                 <w:color w:val="000000"/>
               </w:rPr>
-              <w:t>Grounded written review</w:t>
+              <w:t>evidence array plus reasoning</w:t>
+            </w:r>
+          </w:p>
+        </w:tc>
+      </w:tr>
+      <w:tr>
+        <w:tc>
+          <w:tcPr>
+            <w:tcW w:type="dxa" w:w="1944"/>
+            <w:tcMar>
+              <w:top w:w="60" w:type="dxa"/>
+              <w:start w:w="95" w:type="dxa"/>
+              <w:bottom w:w="60" w:type="dxa"/>
+              <w:end w:w="95" w:type="dxa"/>
+            </w:tcMar>
+            <w:vAlign w:val="center"/>
+          </w:tcPr>
+          <w:p>
+            <w:r>
+              <w:rPr>
+                <w:color w:val="000000"/>
+              </w:rPr>
+              <w:t>Reproducibility</w:t>
+            </w:r>
+          </w:p>
+        </w:tc>
+        <w:tc>
+          <w:tcPr>
+            <w:tcW w:type="dxa" w:w="4752"/>
+            <w:tcMar>
+              <w:top w:w="60" w:type="dxa"/>
+              <w:start w:w="95" w:type="dxa"/>
+              <w:bottom w:w="60" w:type="dxa"/>
+              <w:end w:w="95" w:type="dxa"/>
+            </w:tcMar>
+            <w:vAlign w:val="center"/>
+          </w:tcPr>
+          <w:p>
+            <w:r>
+              <w:rPr>
+                <w:color w:val="000000"/>
+              </w:rPr>
+              <w:t>Standalone FastAPI app, Docker/Render config, fixture data, and tests</w:t>
+            </w:r>
+          </w:p>
+        </w:tc>
+        <w:tc>
+          <w:tcPr>
+            <w:tcW w:type="dxa" w:w="2520"/>
+            <w:tcMar>
+              <w:top w:w="60" w:type="dxa"/>
+              <w:start w:w="95" w:type="dxa"/>
+              <w:bottom w:w="60" w:type="dxa"/>
+              <w:end w:w="95" w:type="dxa"/>
+            </w:tcMar>
+            <w:vAlign w:val="center"/>
+          </w:tcPr>
+          <w:p>
+            <w:r>
+              <w:rPr>
+                <w:color w:val="000000"/>
+              </w:rPr>
+              <w:t>app.task_a_main:app</w:t>
             </w:r>
           </w:p>
         </w:tc>
@@ -387,61 +532,13 @@
     </w:tbl>
     <w:p>
       <w:pPr>
-        <w:pStyle w:val="Heading2"/>
+        <w:pStyle w:val="Heading1"/>
       </w:pPr>
       <w:r>
         <w:rPr>
           <w:color w:val="000000"/>
         </w:rPr>
-        <w:t>Why This Is Different</w:t>
-      </w:r>
-    </w:p>
-    <w:p>
-      <w:pPr>
-        <w:pStyle w:val="ListBullet"/>
-        <w:spacing w:after="50"/>
-      </w:pPr>
-      <w:r>
-        <w:rPr>
-          <w:color w:val="000000"/>
-        </w:rPr>
-        <w:t>The LLM does not invent the rating; local interpretable scoring predicts it first.</w:t>
-      </w:r>
-    </w:p>
-    <w:p>
-      <w:pPr>
-        <w:pStyle w:val="ListBullet"/>
-        <w:spacing w:after="50"/>
-      </w:pPr>
-      <w:r>
-        <w:rPr>
-          <w:color w:val="000000"/>
-        </w:rPr>
-        <w:t>Groq is used after the rating decision to improve fluency and review realism.</w:t>
-      </w:r>
-    </w:p>
-    <w:p>
-      <w:pPr>
-        <w:pStyle w:val="ListBullet"/>
-        <w:spacing w:after="50"/>
-      </w:pPr>
-      <w:r>
-        <w:rPr>
-          <w:color w:val="000000"/>
-        </w:rPr>
-        <w:t>The response includes confidence, reasoning, and evidence so judges can inspect behavior.</w:t>
-      </w:r>
-    </w:p>
-    <w:p>
-      <w:pPr>
-        <w:pStyle w:val="ListBullet"/>
-        <w:spacing w:after="50"/>
-      </w:pPr>
-      <w:r>
-        <w:rPr>
-          <w:color w:val="000000"/>
-        </w:rPr>
-        <w:t>If no hosted key is configured, deterministic fallback generation keeps the task reproducible.</w:t>
+        <w:t>1. Problem and Opportunity</w:t>
       </w:r>
     </w:p>
     <w:p>
@@ -449,7 +546,15 @@
         <w:rPr>
           <w:color w:val="000000"/>
         </w:rPr>
-        <w:br w:type="page"/>
+        <w:t>Most review simulators either memorize product averages or ask an LLM to invent a plausible review. Both approaches miss the point of the challenge. A user's rating is shaped by their own strictness, their category interests, price sensitivity, previous experiences, and the moment in which the product is being evaluated. For Nigerian users, this context can include student budgets, family shopping patterns, heat or harmattan conditions, local media taste, and the natural mix of English and Nigerian language styles.</w:t>
+      </w:r>
+    </w:p>
+    <w:p>
+      <w:r>
+        <w:rPr>
+          <w:color w:val="000000"/>
+        </w:rPr>
+        <w:t>The opportunity is to make review generation measurable and inspectable. The system should not only produce nice text; it should expose why it believes this user would give this rating.</w:t>
       </w:r>
     </w:p>
     <w:p>
@@ -460,15 +565,7 @@
         <w:rPr>
           <w:color w:val="000000"/>
         </w:rPr>
-        <w:t>Model and Data Strategy</w:t>
-      </w:r>
-    </w:p>
-    <w:p>
-      <w:r>
-        <w:rPr>
-          <w:color w:val="000000"/>
-        </w:rPr>
-        <w:t>The rating model combines user average, item average, category affinity, preference overlap, dislike penalties, text match, and budget sensitivity. Review generation is retrieval-augmented: the agent supplies similar prior reviews and persona traits to Groq, then validates the output shape before returning it.</w:t>
+        <w:t>2. Why Team Ace Is Different</w:t>
       </w:r>
     </w:p>
     <w:tbl>
@@ -479,19 +576,21 @@
         <w:tblLook w:firstColumn="1" w:firstRow="1" w:lastColumn="0" w:lastRow="0" w:noHBand="0" w:noVBand="1" w:val="04A0"/>
       </w:tblPr>
       <w:tblGrid>
-        <w:gridCol w:w="5040"/>
-        <w:gridCol w:w="5040"/>
+        <w:gridCol w:w="2541"/>
+        <w:gridCol w:w="2541"/>
+        <w:gridCol w:w="2541"/>
+        <w:gridCol w:w="2541"/>
       </w:tblGrid>
       <w:tr>
         <w:tc>
           <w:tcPr>
-            <w:tcW w:type="dxa" w:w="2592"/>
+            <w:tcW w:type="dxa" w:w="1584"/>
             <w:shd w:fill="E6E6E6"/>
             <w:tcMar>
-              <w:top w:w="70" w:type="dxa"/>
-              <w:start w:w="100" w:type="dxa"/>
-              <w:bottom w:w="70" w:type="dxa"/>
-              <w:end w:w="100" w:type="dxa"/>
+              <w:top w:w="60" w:type="dxa"/>
+              <w:start w:w="95" w:type="dxa"/>
+              <w:bottom w:w="60" w:type="dxa"/>
+              <w:end w:w="95" w:type="dxa"/>
             </w:tcMar>
             <w:vAlign w:val="center"/>
           </w:tcPr>
@@ -501,19 +600,19 @@
                 <w:b/>
                 <w:color w:val="000000"/>
               </w:rPr>
-              <w:t>Feature</w:t>
+              <w:t>Aspect</w:t>
             </w:r>
           </w:p>
         </w:tc>
         <w:tc>
           <w:tcPr>
-            <w:tcW w:type="dxa" w:w="6768"/>
+            <w:tcW w:type="dxa" w:w="2376"/>
             <w:shd w:fill="E6E6E6"/>
             <w:tcMar>
-              <w:top w:w="70" w:type="dxa"/>
-              <w:start w:w="100" w:type="dxa"/>
-              <w:bottom w:w="70" w:type="dxa"/>
-              <w:end w:w="100" w:type="dxa"/>
+              <w:top w:w="60" w:type="dxa"/>
+              <w:start w:w="95" w:type="dxa"/>
+              <w:bottom w:w="60" w:type="dxa"/>
+              <w:end w:w="95" w:type="dxa"/>
             </w:tcMar>
             <w:vAlign w:val="center"/>
           </w:tcPr>
@@ -523,256 +622,19 @@
                 <w:b/>
                 <w:color w:val="000000"/>
               </w:rPr>
-              <w:t>Reason It Matters</w:t>
-            </w:r>
-          </w:p>
-        </w:tc>
-      </w:tr>
-      <w:tr>
-        <w:tc>
-          <w:tcPr>
-            <w:tcW w:type="dxa" w:w="2592"/>
-            <w:tcMar>
-              <w:top w:w="70" w:type="dxa"/>
-              <w:start w:w="100" w:type="dxa"/>
-              <w:bottom w:w="70" w:type="dxa"/>
-              <w:end w:w="100" w:type="dxa"/>
-            </w:tcMar>
-            <w:vAlign w:val="center"/>
-          </w:tcPr>
-          <w:p>
-            <w:r>
-              <w:rPr>
-                <w:color w:val="000000"/>
-              </w:rPr>
-              <w:t>Rating bias</w:t>
+              <w:t>Typical Approach</w:t>
             </w:r>
           </w:p>
         </w:tc>
         <w:tc>
           <w:tcPr>
-            <w:tcW w:type="dxa" w:w="6768"/>
-            <w:tcMar>
-              <w:top w:w="70" w:type="dxa"/>
-              <w:start w:w="100" w:type="dxa"/>
-              <w:bottom w:w="70" w:type="dxa"/>
-              <w:end w:w="100" w:type="dxa"/>
-            </w:tcMar>
-            <w:vAlign w:val="center"/>
-          </w:tcPr>
-          <w:p>
-            <w:r>
-              <w:rPr>
-                <w:color w:val="000000"/>
-              </w:rPr>
-              <w:t>Some users are naturally generous while others are strict.</w:t>
-            </w:r>
-          </w:p>
-        </w:tc>
-      </w:tr>
-      <w:tr>
-        <w:tc>
-          <w:tcPr>
-            <w:tcW w:type="dxa" w:w="2592"/>
-            <w:tcMar>
-              <w:top w:w="70" w:type="dxa"/>
-              <w:start w:w="100" w:type="dxa"/>
-              <w:bottom w:w="70" w:type="dxa"/>
-              <w:end w:w="100" w:type="dxa"/>
-            </w:tcMar>
-            <w:vAlign w:val="center"/>
-          </w:tcPr>
-          <w:p>
-            <w:r>
-              <w:rPr>
-                <w:color w:val="000000"/>
-              </w:rPr>
-              <w:t>Category affinity</w:t>
-            </w:r>
-          </w:p>
-        </w:tc>
-        <w:tc>
-          <w:tcPr>
-            <w:tcW w:type="dxa" w:w="6768"/>
-            <w:tcMar>
-              <w:top w:w="70" w:type="dxa"/>
-              <w:start w:w="100" w:type="dxa"/>
-              <w:bottom w:w="70" w:type="dxa"/>
-              <w:end w:w="100" w:type="dxa"/>
-            </w:tcMar>
-            <w:vAlign w:val="center"/>
-          </w:tcPr>
-          <w:p>
-            <w:r>
-              <w:rPr>
-                <w:color w:val="000000"/>
-              </w:rPr>
-              <w:t>A user who loves games may judge games differently from beauty products.</w:t>
-            </w:r>
-          </w:p>
-        </w:tc>
-      </w:tr>
-      <w:tr>
-        <w:tc>
-          <w:tcPr>
-            <w:tcW w:type="dxa" w:w="2592"/>
-            <w:tcMar>
-              <w:top w:w="70" w:type="dxa"/>
-              <w:start w:w="100" w:type="dxa"/>
-              <w:bottom w:w="70" w:type="dxa"/>
-              <w:end w:w="100" w:type="dxa"/>
-            </w:tcMar>
-            <w:vAlign w:val="center"/>
-          </w:tcPr>
-          <w:p>
-            <w:r>
-              <w:rPr>
-                <w:color w:val="000000"/>
-              </w:rPr>
-              <w:t>Likes/dislikes</w:t>
-            </w:r>
-          </w:p>
-        </w:tc>
-        <w:tc>
-          <w:tcPr>
-            <w:tcW w:type="dxa" w:w="6768"/>
-            <w:tcMar>
-              <w:top w:w="70" w:type="dxa"/>
-              <w:start w:w="100" w:type="dxa"/>
-              <w:bottom w:w="70" w:type="dxa"/>
-              <w:end w:w="100" w:type="dxa"/>
-            </w:tcMar>
-            <w:vAlign w:val="center"/>
-          </w:tcPr>
-          <w:p>
-            <w:r>
-              <w:rPr>
-                <w:color w:val="000000"/>
-              </w:rPr>
-              <w:t>Explicit preferences make the review more behaviorally faithful.</w:t>
-            </w:r>
-          </w:p>
-        </w:tc>
-      </w:tr>
-      <w:tr>
-        <w:tc>
-          <w:tcPr>
-            <w:tcW w:type="dxa" w:w="2592"/>
-            <w:tcMar>
-              <w:top w:w="70" w:type="dxa"/>
-              <w:start w:w="100" w:type="dxa"/>
-              <w:bottom w:w="70" w:type="dxa"/>
-              <w:end w:w="100" w:type="dxa"/>
-            </w:tcMar>
-            <w:vAlign w:val="center"/>
-          </w:tcPr>
-          <w:p>
-            <w:r>
-              <w:rPr>
-                <w:color w:val="000000"/>
-              </w:rPr>
-              <w:t>Budget level</w:t>
-            </w:r>
-          </w:p>
-        </w:tc>
-        <w:tc>
-          <w:tcPr>
-            <w:tcW w:type="dxa" w:w="6768"/>
-            <w:tcMar>
-              <w:top w:w="70" w:type="dxa"/>
-              <w:start w:w="100" w:type="dxa"/>
-              <w:bottom w:w="70" w:type="dxa"/>
-              <w:end w:w="100" w:type="dxa"/>
-            </w:tcMar>
-            <w:vAlign w:val="center"/>
-          </w:tcPr>
-          <w:p>
-            <w:r>
-              <w:rPr>
-                <w:color w:val="000000"/>
-              </w:rPr>
-              <w:t>Nigerian price sensitivity changes both rating and wording.</w:t>
-            </w:r>
-          </w:p>
-        </w:tc>
-      </w:tr>
-      <w:tr>
-        <w:tc>
-          <w:tcPr>
-            <w:tcW w:type="dxa" w:w="2592"/>
-            <w:tcMar>
-              <w:top w:w="70" w:type="dxa"/>
-              <w:start w:w="100" w:type="dxa"/>
-              <w:bottom w:w="70" w:type="dxa"/>
-              <w:end w:w="100" w:type="dxa"/>
-            </w:tcMar>
-            <w:vAlign w:val="center"/>
-          </w:tcPr>
-          <w:p>
-            <w:r>
-              <w:rPr>
-                <w:color w:val="000000"/>
-              </w:rPr>
-              <w:t>Retrieval evidence</w:t>
-            </w:r>
-          </w:p>
-        </w:tc>
-        <w:tc>
-          <w:tcPr>
-            <w:tcW w:type="dxa" w:w="6768"/>
-            <w:tcMar>
-              <w:top w:w="70" w:type="dxa"/>
-              <w:start w:w="100" w:type="dxa"/>
-              <w:bottom w:w="70" w:type="dxa"/>
-              <w:end w:w="100" w:type="dxa"/>
-            </w:tcMar>
-            <w:vAlign w:val="center"/>
-          </w:tcPr>
-          <w:p>
-            <w:r>
-              <w:rPr>
-                <w:color w:val="000000"/>
-              </w:rPr>
-              <w:t>Generated reviews stay grounded in the user's prior tone and history.</w:t>
-            </w:r>
-          </w:p>
-        </w:tc>
-      </w:tr>
-    </w:tbl>
-    <w:p>
-      <w:pPr>
-        <w:pStyle w:val="Heading2"/>
-      </w:pPr>
-      <w:r>
-        <w:rPr>
-          <w:color w:val="000000"/>
-        </w:rPr>
-        <w:t>Evaluation</w:t>
-      </w:r>
-    </w:p>
-    <w:tbl>
-      <w:tblPr>
-        <w:tblStyle w:val="TableGrid"/>
-        <w:tblW w:type="auto" w:w="0"/>
-        <w:jc w:val="left"/>
-        <w:tblLook w:firstColumn="1" w:firstRow="1" w:lastColumn="0" w:lastRow="0" w:noHBand="0" w:noVBand="1" w:val="04A0"/>
-      </w:tblPr>
-      <w:tblGrid>
-        <w:gridCol w:w="2520"/>
-        <w:gridCol w:w="2520"/>
-        <w:gridCol w:w="2520"/>
-        <w:gridCol w:w="2520"/>
-      </w:tblGrid>
-      <w:tr>
-        <w:tc>
-          <w:tcPr>
-            <w:tcW w:type="dxa" w:w="1872"/>
+            <w:tcW w:type="dxa" w:w="3384"/>
             <w:shd w:fill="E6E6E6"/>
             <w:tcMar>
-              <w:top w:w="70" w:type="dxa"/>
-              <w:start w:w="100" w:type="dxa"/>
-              <w:bottom w:w="70" w:type="dxa"/>
-              <w:end w:w="100" w:type="dxa"/>
+              <w:top w:w="60" w:type="dxa"/>
+              <w:start w:w="95" w:type="dxa"/>
+              <w:bottom w:w="60" w:type="dxa"/>
+              <w:end w:w="95" w:type="dxa"/>
             </w:tcMar>
             <w:vAlign w:val="center"/>
           </w:tcPr>
@@ -782,19 +644,19 @@
                 <w:b/>
                 <w:color w:val="000000"/>
               </w:rPr>
-              <w:t>Metric</w:t>
+              <w:t>Team Ace Approach</w:t>
             </w:r>
           </w:p>
         </w:tc>
         <w:tc>
           <w:tcPr>
-            <w:tcW w:type="dxa" w:w="1872"/>
+            <w:tcW w:type="dxa" w:w="2015"/>
             <w:shd w:fill="E6E6E6"/>
             <w:tcMar>
-              <w:top w:w="70" w:type="dxa"/>
-              <w:start w:w="100" w:type="dxa"/>
-              <w:bottom w:w="70" w:type="dxa"/>
-              <w:end w:w="100" w:type="dxa"/>
+              <w:top w:w="60" w:type="dxa"/>
+              <w:start w:w="95" w:type="dxa"/>
+              <w:bottom w:w="60" w:type="dxa"/>
+              <w:end w:w="95" w:type="dxa"/>
             </w:tcMar>
             <w:vAlign w:val="center"/>
           </w:tcPr>
@@ -804,51 +666,7 @@
                 <w:b/>
                 <w:color w:val="000000"/>
               </w:rPr>
-              <w:t>Team Ace</w:t>
-            </w:r>
-          </w:p>
-        </w:tc>
-        <w:tc>
-          <w:tcPr>
-            <w:tcW w:type="dxa" w:w="1872"/>
-            <w:shd w:fill="E6E6E6"/>
-            <w:tcMar>
-              <w:top w:w="70" w:type="dxa"/>
-              <w:start w:w="100" w:type="dxa"/>
-              <w:bottom w:w="70" w:type="dxa"/>
-              <w:end w:w="100" w:type="dxa"/>
-            </w:tcMar>
-            <w:vAlign w:val="center"/>
-          </w:tcPr>
-          <w:p>
-            <w:r>
-              <w:rPr>
-                <w:b/>
-                <w:color w:val="000000"/>
-              </w:rPr>
-              <w:t>Baseline</w:t>
-            </w:r>
-          </w:p>
-        </w:tc>
-        <w:tc>
-          <w:tcPr>
-            <w:tcW w:type="dxa" w:w="3744"/>
-            <w:shd w:fill="E6E6E6"/>
-            <w:tcMar>
-              <w:top w:w="70" w:type="dxa"/>
-              <w:start w:w="100" w:type="dxa"/>
-              <w:bottom w:w="70" w:type="dxa"/>
-              <w:end w:w="100" w:type="dxa"/>
-            </w:tcMar>
-            <w:vAlign w:val="center"/>
-          </w:tcPr>
-          <w:p>
-            <w:r>
-              <w:rPr>
-                <w:b/>
-                <w:color w:val="000000"/>
-              </w:rPr>
-              <w:t>Interpretation</w:t>
+              <w:t>Advantage</w:t>
             </w:r>
           </w:p>
         </w:tc>
@@ -856,12 +674,12 @@
       <w:tr>
         <w:tc>
           <w:tcPr>
-            <w:tcW w:type="dxa" w:w="1872"/>
+            <w:tcW w:type="dxa" w:w="1584"/>
             <w:tcMar>
-              <w:top w:w="70" w:type="dxa"/>
-              <w:start w:w="100" w:type="dxa"/>
-              <w:bottom w:w="70" w:type="dxa"/>
-              <w:end w:w="100" w:type="dxa"/>
+              <w:top w:w="60" w:type="dxa"/>
+              <w:start w:w="95" w:type="dxa"/>
+              <w:bottom w:w="60" w:type="dxa"/>
+              <w:end w:w="95" w:type="dxa"/>
             </w:tcMar>
             <w:vAlign w:val="center"/>
           </w:tcPr>
@@ -870,18 +688,18 @@
               <w:rPr>
                 <w:color w:val="000000"/>
               </w:rPr>
-              <w:t>RMSE</w:t>
+              <w:t>Rating</w:t>
             </w:r>
           </w:p>
         </w:tc>
         <w:tc>
           <w:tcPr>
-            <w:tcW w:type="dxa" w:w="1872"/>
+            <w:tcW w:type="dxa" w:w="2376"/>
             <w:tcMar>
-              <w:top w:w="70" w:type="dxa"/>
-              <w:start w:w="100" w:type="dxa"/>
-              <w:bottom w:w="70" w:type="dxa"/>
-              <w:end w:w="100" w:type="dxa"/>
+              <w:top w:w="60" w:type="dxa"/>
+              <w:start w:w="95" w:type="dxa"/>
+              <w:bottom w:w="60" w:type="dxa"/>
+              <w:end w:w="95" w:type="dxa"/>
             </w:tcMar>
             <w:vAlign w:val="center"/>
           </w:tcPr>
@@ -890,18 +708,18 @@
               <w:rPr>
                 <w:color w:val="000000"/>
               </w:rPr>
-              <w:t>0.7357</w:t>
+              <w:t>LLM guesses the stars</w:t>
             </w:r>
           </w:p>
         </w:tc>
         <w:tc>
           <w:tcPr>
-            <w:tcW w:type="dxa" w:w="1872"/>
+            <w:tcW w:type="dxa" w:w="3384"/>
             <w:tcMar>
-              <w:top w:w="70" w:type="dxa"/>
-              <w:start w:w="100" w:type="dxa"/>
-              <w:bottom w:w="70" w:type="dxa"/>
-              <w:end w:w="100" w:type="dxa"/>
+              <w:top w:w="60" w:type="dxa"/>
+              <w:start w:w="95" w:type="dxa"/>
+              <w:bottom w:w="60" w:type="dxa"/>
+              <w:end w:w="95" w:type="dxa"/>
             </w:tcMar>
             <w:vAlign w:val="center"/>
           </w:tcPr>
@@ -910,18 +728,18 @@
               <w:rPr>
                 <w:color w:val="000000"/>
               </w:rPr>
-              <w:t>1.3133</w:t>
+              <w:t>Local interpretable scoring</w:t>
             </w:r>
           </w:p>
         </w:tc>
         <w:tc>
           <w:tcPr>
-            <w:tcW w:type="dxa" w:w="3744"/>
+            <w:tcW w:type="dxa" w:w="2015"/>
             <w:tcMar>
-              <w:top w:w="70" w:type="dxa"/>
-              <w:start w:w="100" w:type="dxa"/>
-              <w:bottom w:w="70" w:type="dxa"/>
-              <w:end w:w="100" w:type="dxa"/>
+              <w:top w:w="60" w:type="dxa"/>
+              <w:start w:w="95" w:type="dxa"/>
+              <w:bottom w:w="60" w:type="dxa"/>
+              <w:end w:w="95" w:type="dxa"/>
             </w:tcMar>
             <w:vAlign w:val="center"/>
           </w:tcPr>
@@ -930,7 +748,253 @@
               <w:rPr>
                 <w:color w:val="000000"/>
               </w:rPr>
-              <w:t>Personalized behavior reduces rating error on the real Amazon subset.</w:t>
+              <w:t>Auditable and testable</w:t>
+            </w:r>
+          </w:p>
+        </w:tc>
+      </w:tr>
+      <w:tr>
+        <w:tc>
+          <w:tcPr>
+            <w:tcW w:type="dxa" w:w="1584"/>
+            <w:tcMar>
+              <w:top w:w="60" w:type="dxa"/>
+              <w:start w:w="95" w:type="dxa"/>
+              <w:bottom w:w="60" w:type="dxa"/>
+              <w:end w:w="95" w:type="dxa"/>
+            </w:tcMar>
+            <w:vAlign w:val="center"/>
+          </w:tcPr>
+          <w:p>
+            <w:r>
+              <w:rPr>
+                <w:color w:val="000000"/>
+              </w:rPr>
+              <w:t>Review text</w:t>
+            </w:r>
+          </w:p>
+        </w:tc>
+        <w:tc>
+          <w:tcPr>
+            <w:tcW w:type="dxa" w:w="2376"/>
+            <w:tcMar>
+              <w:top w:w="60" w:type="dxa"/>
+              <w:start w:w="95" w:type="dxa"/>
+              <w:bottom w:w="60" w:type="dxa"/>
+              <w:end w:w="95" w:type="dxa"/>
+            </w:tcMar>
+            <w:vAlign w:val="center"/>
+          </w:tcPr>
+          <w:p>
+            <w:r>
+              <w:rPr>
+                <w:color w:val="000000"/>
+              </w:rPr>
+              <w:t>Ungrounded free generation</w:t>
+            </w:r>
+          </w:p>
+        </w:tc>
+        <w:tc>
+          <w:tcPr>
+            <w:tcW w:type="dxa" w:w="3384"/>
+            <w:tcMar>
+              <w:top w:w="60" w:type="dxa"/>
+              <w:start w:w="95" w:type="dxa"/>
+              <w:bottom w:w="60" w:type="dxa"/>
+              <w:end w:w="95" w:type="dxa"/>
+            </w:tcMar>
+            <w:vAlign w:val="center"/>
+          </w:tcPr>
+          <w:p>
+            <w:r>
+              <w:rPr>
+                <w:color w:val="000000"/>
+              </w:rPr>
+              <w:t>Retrieved evidence plus persona prompt</w:t>
+            </w:r>
+          </w:p>
+        </w:tc>
+        <w:tc>
+          <w:tcPr>
+            <w:tcW w:type="dxa" w:w="2015"/>
+            <w:tcMar>
+              <w:top w:w="60" w:type="dxa"/>
+              <w:start w:w="95" w:type="dxa"/>
+              <w:bottom w:w="60" w:type="dxa"/>
+              <w:end w:w="95" w:type="dxa"/>
+            </w:tcMar>
+            <w:vAlign w:val="center"/>
+          </w:tcPr>
+          <w:p>
+            <w:r>
+              <w:rPr>
+                <w:color w:val="000000"/>
+              </w:rPr>
+              <w:t>More behaviorally faithful</w:t>
+            </w:r>
+          </w:p>
+        </w:tc>
+      </w:tr>
+      <w:tr>
+        <w:tc>
+          <w:tcPr>
+            <w:tcW w:type="dxa" w:w="1584"/>
+            <w:tcMar>
+              <w:top w:w="60" w:type="dxa"/>
+              <w:start w:w="95" w:type="dxa"/>
+              <w:bottom w:w="60" w:type="dxa"/>
+              <w:end w:w="95" w:type="dxa"/>
+            </w:tcMar>
+            <w:vAlign w:val="center"/>
+          </w:tcPr>
+          <w:p>
+            <w:r>
+              <w:rPr>
+                <w:color w:val="000000"/>
+              </w:rPr>
+              <w:t>User model</w:t>
+            </w:r>
+          </w:p>
+        </w:tc>
+        <w:tc>
+          <w:tcPr>
+            <w:tcW w:type="dxa" w:w="2376"/>
+            <w:tcMar>
+              <w:top w:w="60" w:type="dxa"/>
+              <w:start w:w="95" w:type="dxa"/>
+              <w:bottom w:w="60" w:type="dxa"/>
+              <w:end w:w="95" w:type="dxa"/>
+            </w:tcMar>
+            <w:vAlign w:val="center"/>
+          </w:tcPr>
+          <w:p>
+            <w:r>
+              <w:rPr>
+                <w:color w:val="000000"/>
+              </w:rPr>
+              <w:t>Static profile fields</w:t>
+            </w:r>
+          </w:p>
+        </w:tc>
+        <w:tc>
+          <w:tcPr>
+            <w:tcW w:type="dxa" w:w="3384"/>
+            <w:tcMar>
+              <w:top w:w="60" w:type="dxa"/>
+              <w:start w:w="95" w:type="dxa"/>
+              <w:bottom w:w="60" w:type="dxa"/>
+              <w:end w:w="95" w:type="dxa"/>
+            </w:tcMar>
+            <w:vAlign w:val="center"/>
+          </w:tcPr>
+          <w:p>
+            <w:r>
+              <w:rPr>
+                <w:color w:val="000000"/>
+              </w:rPr>
+              <w:t>Dynamic traces from history and context</w:t>
+            </w:r>
+          </w:p>
+        </w:tc>
+        <w:tc>
+          <w:tcPr>
+            <w:tcW w:type="dxa" w:w="2015"/>
+            <w:tcMar>
+              <w:top w:w="60" w:type="dxa"/>
+              <w:start w:w="95" w:type="dxa"/>
+              <w:bottom w:w="60" w:type="dxa"/>
+              <w:end w:w="95" w:type="dxa"/>
+            </w:tcMar>
+            <w:vAlign w:val="center"/>
+          </w:tcPr>
+          <w:p>
+            <w:r>
+              <w:rPr>
+                <w:color w:val="000000"/>
+              </w:rPr>
+              <w:t>Captures changing behavior</w:t>
+            </w:r>
+          </w:p>
+        </w:tc>
+      </w:tr>
+      <w:tr>
+        <w:tc>
+          <w:tcPr>
+            <w:tcW w:type="dxa" w:w="1584"/>
+            <w:tcMar>
+              <w:top w:w="60" w:type="dxa"/>
+              <w:start w:w="95" w:type="dxa"/>
+              <w:bottom w:w="60" w:type="dxa"/>
+              <w:end w:w="95" w:type="dxa"/>
+            </w:tcMar>
+            <w:vAlign w:val="center"/>
+          </w:tcPr>
+          <w:p>
+            <w:r>
+              <w:rPr>
+                <w:color w:val="000000"/>
+              </w:rPr>
+              <w:t>Nigerian fit</w:t>
+            </w:r>
+          </w:p>
+        </w:tc>
+        <w:tc>
+          <w:tcPr>
+            <w:tcW w:type="dxa" w:w="2376"/>
+            <w:tcMar>
+              <w:top w:w="60" w:type="dxa"/>
+              <w:start w:w="95" w:type="dxa"/>
+              <w:bottom w:w="60" w:type="dxa"/>
+              <w:end w:w="95" w:type="dxa"/>
+            </w:tcMar>
+            <w:vAlign w:val="center"/>
+          </w:tcPr>
+          <w:p>
+            <w:r>
+              <w:rPr>
+                <w:color w:val="000000"/>
+              </w:rPr>
+              <w:t>Generic global shopper</w:t>
+            </w:r>
+          </w:p>
+        </w:tc>
+        <w:tc>
+          <w:tcPr>
+            <w:tcW w:type="dxa" w:w="3384"/>
+            <w:tcMar>
+              <w:top w:w="60" w:type="dxa"/>
+              <w:start w:w="95" w:type="dxa"/>
+              <w:bottom w:w="60" w:type="dxa"/>
+              <w:end w:w="95" w:type="dxa"/>
+            </w:tcMar>
+            <w:vAlign w:val="center"/>
+          </w:tcPr>
+          <w:p>
+            <w:r>
+              <w:rPr>
+                <w:color w:val="000000"/>
+              </w:rPr>
+              <w:t>Budget, family, location, language, and routine signals</w:t>
+            </w:r>
+          </w:p>
+        </w:tc>
+        <w:tc>
+          <w:tcPr>
+            <w:tcW w:type="dxa" w:w="2015"/>
+            <w:tcMar>
+              <w:top w:w="60" w:type="dxa"/>
+              <w:start w:w="95" w:type="dxa"/>
+              <w:bottom w:w="60" w:type="dxa"/>
+              <w:end w:w="95" w:type="dxa"/>
+            </w:tcMar>
+            <w:vAlign w:val="center"/>
+          </w:tcPr>
+          <w:p>
+            <w:r>
+              <w:rPr>
+                <w:color w:val="000000"/>
+              </w:rPr>
+              <w:t>More realistic local output</w:t>
             </w:r>
           </w:p>
         </w:tc>
@@ -952,67 +1016,413 @@
         <w:rPr>
           <w:color w:val="000000"/>
         </w:rPr>
-        <w:t>Demo, Reproducibility, and Limitations</w:t>
+        <w:t>3. Architecture and Agentic Workflow</w:t>
       </w:r>
     </w:p>
     <w:p>
       <w:pPr>
-        <w:pStyle w:val="ListBullet"/>
-        <w:spacing w:after="50"/>
+        <w:spacing w:after="20"/>
+        <w:jc w:val="center"/>
       </w:pPr>
       <w:r>
         <w:rPr>
           <w:color w:val="000000"/>
         </w:rPr>
-        <w:t>Standalone deployment entrypoint: app.task_a_main:app.</w:t>
+        <w:drawing>
+          <wp:inline xmlns:a="http://schemas.openxmlformats.org/drawingml/2006/main" xmlns:pic="http://schemas.openxmlformats.org/drawingml/2006/picture">
+            <wp:extent cx="5806440" cy="2758059"/>
+            <wp:docPr id="2" name="Picture 2"/>
+            <wp:cNvGraphicFramePr>
+              <a:graphicFrameLocks noChangeAspect="1"/>
+            </wp:cNvGraphicFramePr>
+            <a:graphic>
+              <a:graphicData uri="http://schemas.openxmlformats.org/drawingml/2006/picture">
+                <pic:pic>
+                  <pic:nvPicPr>
+                    <pic:cNvPr id="0" name="architecture.png"/>
+                    <pic:cNvPicPr/>
+                  </pic:nvPicPr>
+                  <pic:blipFill>
+                    <a:blip r:embed="rId12"/>
+                    <a:stretch>
+                      <a:fillRect/>
+                    </a:stretch>
+                  </pic:blipFill>
+                  <pic:spPr>
+                    <a:xfrm>
+                      <a:off x="0" y="0"/>
+                      <a:ext cx="5806440" cy="2758059"/>
+                    </a:xfrm>
+                    <a:prstGeom prst="rect"/>
+                  </pic:spPr>
+                </pic:pic>
+              </a:graphicData>
+            </a:graphic>
+          </wp:inline>
+        </w:drawing>
       </w:r>
     </w:p>
     <w:p>
       <w:pPr>
-        <w:pStyle w:val="ListBullet"/>
-        <w:spacing w:after="50"/>
+        <w:jc w:val="center"/>
+      </w:pPr>
+      <w:r>
+        <w:rPr>
+          <w:color w:val="000000"/>
+          <w:sz w:val="16"/>
+        </w:rPr>
+        <w:t>Figure 1. Task A uses the shared agent architecture but activates the rating and review path.</w:t>
+      </w:r>
+    </w:p>
+    <w:p>
+      <w:pPr>
+        <w:pStyle w:val="ListNumber"/>
+        <w:spacing w:after="40"/>
       </w:pPr>
       <w:r>
         <w:rPr>
           <w:color w:val="000000"/>
         </w:rPr>
-        <w:t>Web UI: root path opens the Task A review simulator directly.</w:t>
+        <w:t>Read the persona and summarize rating bias, tone, category interests, likes, dislikes, budget level, location, and language preference.</w:t>
       </w:r>
     </w:p>
     <w:p>
       <w:pPr>
-        <w:pStyle w:val="ListBullet"/>
-        <w:spacing w:after="50"/>
+        <w:pStyle w:val="ListNumber"/>
+        <w:spacing w:after="40"/>
       </w:pPr>
       <w:r>
         <w:rPr>
           <w:color w:val="000000"/>
         </w:rPr>
-        <w:t>API endpoint: POST /api/v1/generate-review.</w:t>
+        <w:t>Compare the unseen product against product metadata, category, price, and the user's prior interactions.</w:t>
       </w:r>
     </w:p>
     <w:p>
       <w:pPr>
-        <w:pStyle w:val="ListBullet"/>
-        <w:spacing w:after="50"/>
+        <w:pStyle w:val="ListNumber"/>
+        <w:spacing w:after="40"/>
       </w:pPr>
       <w:r>
         <w:rPr>
           <w:color w:val="000000"/>
         </w:rPr>
-        <w:t>Voice input fills product context; YarnGPT audio can read localized explanations.</w:t>
+        <w:t>Retrieve similar historical reviews as grounding evidence for the generated review.</w:t>
       </w:r>
     </w:p>
     <w:p>
       <w:pPr>
-        <w:pStyle w:val="ListBullet"/>
-        <w:spacing w:after="50"/>
+        <w:pStyle w:val="ListNumber"/>
+        <w:spacing w:after="40"/>
       </w:pPr>
       <w:r>
         <w:rPr>
           <w:color w:val="000000"/>
         </w:rPr>
-        <w:t>Docker and Render deployment configs are included for judge testing.</w:t>
+        <w:t>Predict rating with the local ensemble before any LLM text is requested.</w:t>
+      </w:r>
+    </w:p>
+    <w:p>
+      <w:pPr>
+        <w:pStyle w:val="ListNumber"/>
+        <w:spacing w:after="40"/>
+      </w:pPr>
+      <w:r>
+        <w:rPr>
+          <w:color w:val="000000"/>
+        </w:rPr>
+        <w:t>Ask Groq to write the review using the validated score, evidence, persona, and product details.</w:t>
+      </w:r>
+    </w:p>
+    <w:p>
+      <w:pPr>
+        <w:pStyle w:val="ListNumber"/>
+        <w:spacing w:after="40"/>
+      </w:pPr>
+      <w:r>
+        <w:rPr>
+          <w:color w:val="000000"/>
+        </w:rPr>
+        <w:t>Return rating, review_text, confidence, reasoning, evidence, llm_provider, and fallback_used.</w:t>
+      </w:r>
+    </w:p>
+    <w:tbl>
+      <w:tblPr>
+        <w:tblStyle w:val="TableGrid"/>
+        <w:tblW w:type="auto" w:w="0"/>
+        <w:jc w:val="left"/>
+        <w:tblLook w:firstColumn="1" w:firstRow="1" w:lastColumn="0" w:lastRow="0" w:noHBand="0" w:noVBand="1" w:val="04A0"/>
+      </w:tblPr>
+      <w:tblGrid>
+        <w:gridCol w:w="5083"/>
+        <w:gridCol w:w="5083"/>
+      </w:tblGrid>
+      <w:tr>
+        <w:tc>
+          <w:tcPr>
+            <w:tcW w:type="dxa" w:w="2232"/>
+            <w:shd w:fill="E6E6E6"/>
+            <w:tcMar>
+              <w:top w:w="60" w:type="dxa"/>
+              <w:start w:w="95" w:type="dxa"/>
+              <w:bottom w:w="60" w:type="dxa"/>
+              <w:end w:w="95" w:type="dxa"/>
+            </w:tcMar>
+            <w:vAlign w:val="center"/>
+          </w:tcPr>
+          <w:p>
+            <w:r>
+              <w:rPr>
+                <w:b/>
+                <w:color w:val="000000"/>
+              </w:rPr>
+              <w:t>Layer</w:t>
+            </w:r>
+          </w:p>
+        </w:tc>
+        <w:tc>
+          <w:tcPr>
+            <w:tcW w:type="dxa" w:w="7128"/>
+            <w:shd w:fill="E6E6E6"/>
+            <w:tcMar>
+              <w:top w:w="60" w:type="dxa"/>
+              <w:start w:w="95" w:type="dxa"/>
+              <w:bottom w:w="60" w:type="dxa"/>
+              <w:end w:w="95" w:type="dxa"/>
+            </w:tcMar>
+            <w:vAlign w:val="center"/>
+          </w:tcPr>
+          <w:p>
+            <w:r>
+              <w:rPr>
+                <w:b/>
+                <w:color w:val="000000"/>
+              </w:rPr>
+              <w:t>Role in Task A</w:t>
+            </w:r>
+          </w:p>
+        </w:tc>
+      </w:tr>
+      <w:tr>
+        <w:tc>
+          <w:tcPr>
+            <w:tcW w:type="dxa" w:w="2232"/>
+            <w:tcMar>
+              <w:top w:w="60" w:type="dxa"/>
+              <w:start w:w="95" w:type="dxa"/>
+              <w:bottom w:w="60" w:type="dxa"/>
+              <w:end w:w="95" w:type="dxa"/>
+            </w:tcMar>
+            <w:vAlign w:val="center"/>
+          </w:tcPr>
+          <w:p>
+            <w:r>
+              <w:rPr>
+                <w:color w:val="000000"/>
+              </w:rPr>
+              <w:t>Persona modeling</w:t>
+            </w:r>
+          </w:p>
+        </w:tc>
+        <w:tc>
+          <w:tcPr>
+            <w:tcW w:type="dxa" w:w="7128"/>
+            <w:tcMar>
+              <w:top w:w="60" w:type="dxa"/>
+              <w:start w:w="95" w:type="dxa"/>
+              <w:bottom w:w="60" w:type="dxa"/>
+              <w:end w:w="95" w:type="dxa"/>
+            </w:tcMar>
+            <w:vAlign w:val="center"/>
+          </w:tcPr>
+          <w:p>
+            <w:r>
+              <w:rPr>
+                <w:color w:val="000000"/>
+              </w:rPr>
+              <w:t>Builds the user's behavioral memory from stated profile and review history.</w:t>
+            </w:r>
+          </w:p>
+        </w:tc>
+      </w:tr>
+      <w:tr>
+        <w:tc>
+          <w:tcPr>
+            <w:tcW w:type="dxa" w:w="2232"/>
+            <w:tcMar>
+              <w:top w:w="60" w:type="dxa"/>
+              <w:start w:w="95" w:type="dxa"/>
+              <w:bottom w:w="60" w:type="dxa"/>
+              <w:end w:w="95" w:type="dxa"/>
+            </w:tcMar>
+            <w:vAlign w:val="center"/>
+          </w:tcPr>
+          <w:p>
+            <w:r>
+              <w:rPr>
+                <w:color w:val="000000"/>
+              </w:rPr>
+              <w:t>Retrieval</w:t>
+            </w:r>
+          </w:p>
+        </w:tc>
+        <w:tc>
+          <w:tcPr>
+            <w:tcW w:type="dxa" w:w="7128"/>
+            <w:tcMar>
+              <w:top w:w="60" w:type="dxa"/>
+              <w:start w:w="95" w:type="dxa"/>
+              <w:bottom w:w="60" w:type="dxa"/>
+              <w:end w:w="95" w:type="dxa"/>
+            </w:tcMar>
+            <w:vAlign w:val="center"/>
+          </w:tcPr>
+          <w:p>
+            <w:r>
+              <w:rPr>
+                <w:color w:val="000000"/>
+              </w:rPr>
+              <w:t>Selects similar interactions to ground tone and evidence.</w:t>
+            </w:r>
+          </w:p>
+        </w:tc>
+      </w:tr>
+      <w:tr>
+        <w:tc>
+          <w:tcPr>
+            <w:tcW w:type="dxa" w:w="2232"/>
+            <w:tcMar>
+              <w:top w:w="60" w:type="dxa"/>
+              <w:start w:w="95" w:type="dxa"/>
+              <w:bottom w:w="60" w:type="dxa"/>
+              <w:end w:w="95" w:type="dxa"/>
+            </w:tcMar>
+            <w:vAlign w:val="center"/>
+          </w:tcPr>
+          <w:p>
+            <w:r>
+              <w:rPr>
+                <w:color w:val="000000"/>
+              </w:rPr>
+              <w:t>Rating engine</w:t>
+            </w:r>
+          </w:p>
+        </w:tc>
+        <w:tc>
+          <w:tcPr>
+            <w:tcW w:type="dxa" w:w="7128"/>
+            <w:tcMar>
+              <w:top w:w="60" w:type="dxa"/>
+              <w:start w:w="95" w:type="dxa"/>
+              <w:bottom w:w="60" w:type="dxa"/>
+              <w:end w:w="95" w:type="dxa"/>
+            </w:tcMar>
+            <w:vAlign w:val="center"/>
+          </w:tcPr>
+          <w:p>
+            <w:r>
+              <w:rPr>
+                <w:color w:val="000000"/>
+              </w:rPr>
+              <w:t>Combines local numerical features into a bounded 1-5 star prediction.</w:t>
+            </w:r>
+          </w:p>
+        </w:tc>
+      </w:tr>
+      <w:tr>
+        <w:tc>
+          <w:tcPr>
+            <w:tcW w:type="dxa" w:w="2232"/>
+            <w:tcMar>
+              <w:top w:w="60" w:type="dxa"/>
+              <w:start w:w="95" w:type="dxa"/>
+              <w:bottom w:w="60" w:type="dxa"/>
+              <w:end w:w="95" w:type="dxa"/>
+            </w:tcMar>
+            <w:vAlign w:val="center"/>
+          </w:tcPr>
+          <w:p>
+            <w:r>
+              <w:rPr>
+                <w:color w:val="000000"/>
+              </w:rPr>
+              <w:t>Groq generation</w:t>
+            </w:r>
+          </w:p>
+        </w:tc>
+        <w:tc>
+          <w:tcPr>
+            <w:tcW w:type="dxa" w:w="7128"/>
+            <w:tcMar>
+              <w:top w:w="60" w:type="dxa"/>
+              <w:start w:w="95" w:type="dxa"/>
+              <w:bottom w:w="60" w:type="dxa"/>
+              <w:end w:w="95" w:type="dxa"/>
+            </w:tcMar>
+            <w:vAlign w:val="center"/>
+          </w:tcPr>
+          <w:p>
+            <w:r>
+              <w:rPr>
+                <w:color w:val="000000"/>
+              </w:rPr>
+              <w:t>Turns the validated decision into fluent review text.</w:t>
+            </w:r>
+          </w:p>
+        </w:tc>
+      </w:tr>
+      <w:tr>
+        <w:tc>
+          <w:tcPr>
+            <w:tcW w:type="dxa" w:w="2232"/>
+            <w:tcMar>
+              <w:top w:w="60" w:type="dxa"/>
+              <w:start w:w="95" w:type="dxa"/>
+              <w:bottom w:w="60" w:type="dxa"/>
+              <w:end w:w="95" w:type="dxa"/>
+            </w:tcMar>
+            <w:vAlign w:val="center"/>
+          </w:tcPr>
+          <w:p>
+            <w:r>
+              <w:rPr>
+                <w:color w:val="000000"/>
+              </w:rPr>
+              <w:t>Fallback layer</w:t>
+            </w:r>
+          </w:p>
+        </w:tc>
+        <w:tc>
+          <w:tcPr>
+            <w:tcW w:type="dxa" w:w="7128"/>
+            <w:tcMar>
+              <w:top w:w="60" w:type="dxa"/>
+              <w:start w:w="95" w:type="dxa"/>
+              <w:bottom w:w="60" w:type="dxa"/>
+              <w:end w:w="95" w:type="dxa"/>
+            </w:tcMar>
+            <w:vAlign w:val="center"/>
+          </w:tcPr>
+          <w:p>
+            <w:r>
+              <w:rPr>
+                <w:color w:val="000000"/>
+              </w:rPr>
+              <w:t>Keeps output reproducible when hosted generation is unavailable.</w:t>
+            </w:r>
+          </w:p>
+        </w:tc>
+      </w:tr>
+    </w:tbl>
+    <w:p>
+      <w:pPr>
+        <w:pStyle w:val="Heading1"/>
+      </w:pPr>
+      <w:r>
+        <w:rPr>
+          <w:color w:val="000000"/>
+        </w:rPr>
+        <w:t>4. Dataset Strategy and Experiments</w:t>
       </w:r>
     </w:p>
     <w:p>
@@ -1020,18 +1430,1523 @@
         <w:rPr>
           <w:color w:val="000000"/>
         </w:rPr>
-        <w:t>Limitations: the checked-in Amazon subset is intentionally small, and some product metadata is review-derived when official metadata streaming is incomplete. Future work would add larger four-domain training, stronger BERTScore evaluation, embedding retrieval, and richer multi-turn memory.</w:t>
+        <w:t>The repository uses a zero-download fixture set for immediate judge demos and a bounded real Amazon Reviews 2023 subset for measurable evaluation. The real subset covers All Beauty, Grocery and Gourmet Food, Movies and TV, and Video Games. The split holds out each user's latest interaction where enough history exists.</w:t>
+      </w:r>
+    </w:p>
+    <w:tbl>
+      <w:tblPr>
+        <w:tblStyle w:val="TableGrid"/>
+        <w:tblW w:type="auto" w:w="0"/>
+        <w:jc w:val="left"/>
+        <w:tblLook w:firstColumn="1" w:firstRow="1" w:lastColumn="0" w:lastRow="0" w:noHBand="0" w:noVBand="1" w:val="04A0"/>
+      </w:tblPr>
+      <w:tblGrid>
+        <w:gridCol w:w="3389"/>
+        <w:gridCol w:w="3389"/>
+        <w:gridCol w:w="3389"/>
+      </w:tblGrid>
+      <w:tr>
+        <w:tc>
+          <w:tcPr>
+            <w:tcW w:type="dxa" w:w="1872"/>
+            <w:shd w:fill="E6E6E6"/>
+            <w:tcMar>
+              <w:top w:w="60" w:type="dxa"/>
+              <w:start w:w="95" w:type="dxa"/>
+              <w:bottom w:w="60" w:type="dxa"/>
+              <w:end w:w="95" w:type="dxa"/>
+            </w:tcMar>
+            <w:vAlign w:val="center"/>
+          </w:tcPr>
+          <w:p>
+            <w:r>
+              <w:rPr>
+                <w:b/>
+                <w:color w:val="000000"/>
+              </w:rPr>
+              <w:t>Dataset Field</w:t>
+            </w:r>
+          </w:p>
+        </w:tc>
+        <w:tc>
+          <w:tcPr>
+            <w:tcW w:type="dxa" w:w="3240"/>
+            <w:shd w:fill="E6E6E6"/>
+            <w:tcMar>
+              <w:top w:w="60" w:type="dxa"/>
+              <w:start w:w="95" w:type="dxa"/>
+              <w:bottom w:w="60" w:type="dxa"/>
+              <w:end w:w="95" w:type="dxa"/>
+            </w:tcMar>
+            <w:vAlign w:val="center"/>
+          </w:tcPr>
+          <w:p>
+            <w:r>
+              <w:rPr>
+                <w:b/>
+                <w:color w:val="000000"/>
+              </w:rPr>
+              <w:t>Value</w:t>
+            </w:r>
+          </w:p>
+        </w:tc>
+        <w:tc>
+          <w:tcPr>
+            <w:tcW w:type="dxa" w:w="4248"/>
+            <w:shd w:fill="E6E6E6"/>
+            <w:tcMar>
+              <w:top w:w="60" w:type="dxa"/>
+              <w:start w:w="95" w:type="dxa"/>
+              <w:bottom w:w="60" w:type="dxa"/>
+              <w:end w:w="95" w:type="dxa"/>
+            </w:tcMar>
+            <w:vAlign w:val="center"/>
+          </w:tcPr>
+          <w:p>
+            <w:r>
+              <w:rPr>
+                <w:b/>
+                <w:color w:val="000000"/>
+              </w:rPr>
+              <w:t>Meaning</w:t>
+            </w:r>
+          </w:p>
+        </w:tc>
+      </w:tr>
+      <w:tr>
+        <w:tc>
+          <w:tcPr>
+            <w:tcW w:type="dxa" w:w="1872"/>
+            <w:tcMar>
+              <w:top w:w="60" w:type="dxa"/>
+              <w:start w:w="95" w:type="dxa"/>
+              <w:bottom w:w="60" w:type="dxa"/>
+              <w:end w:w="95" w:type="dxa"/>
+            </w:tcMar>
+            <w:vAlign w:val="center"/>
+          </w:tcPr>
+          <w:p>
+            <w:r>
+              <w:rPr>
+                <w:color w:val="000000"/>
+              </w:rPr>
+              <w:t>Source</w:t>
+            </w:r>
+          </w:p>
+        </w:tc>
+        <w:tc>
+          <w:tcPr>
+            <w:tcW w:type="dxa" w:w="3240"/>
+            <w:tcMar>
+              <w:top w:w="60" w:type="dxa"/>
+              <w:start w:w="95" w:type="dxa"/>
+              <w:bottom w:w="60" w:type="dxa"/>
+              <w:end w:w="95" w:type="dxa"/>
+            </w:tcMar>
+            <w:vAlign w:val="center"/>
+          </w:tcPr>
+          <w:p>
+            <w:r>
+              <w:rPr>
+                <w:color w:val="000000"/>
+              </w:rPr>
+              <w:t>Amazon Reviews 2023</w:t>
+            </w:r>
+          </w:p>
+        </w:tc>
+        <w:tc>
+          <w:tcPr>
+            <w:tcW w:type="dxa" w:w="4248"/>
+            <w:tcMar>
+              <w:top w:w="60" w:type="dxa"/>
+              <w:start w:w="95" w:type="dxa"/>
+              <w:bottom w:w="60" w:type="dxa"/>
+              <w:end w:w="95" w:type="dxa"/>
+            </w:tcMar>
+            <w:vAlign w:val="center"/>
+          </w:tcPr>
+          <w:p>
+            <w:r>
+              <w:rPr>
+                <w:color w:val="000000"/>
+              </w:rPr>
+              <w:t>Official McAuley Lab review data with bounded local subset</w:t>
+            </w:r>
+          </w:p>
+        </w:tc>
+      </w:tr>
+      <w:tr>
+        <w:tc>
+          <w:tcPr>
+            <w:tcW w:type="dxa" w:w="1872"/>
+            <w:tcMar>
+              <w:top w:w="60" w:type="dxa"/>
+              <w:start w:w="95" w:type="dxa"/>
+              <w:bottom w:w="60" w:type="dxa"/>
+              <w:end w:w="95" w:type="dxa"/>
+            </w:tcMar>
+            <w:vAlign w:val="center"/>
+          </w:tcPr>
+          <w:p>
+            <w:r>
+              <w:rPr>
+                <w:color w:val="000000"/>
+              </w:rPr>
+              <w:t>Categories</w:t>
+            </w:r>
+          </w:p>
+        </w:tc>
+        <w:tc>
+          <w:tcPr>
+            <w:tcW w:type="dxa" w:w="3240"/>
+            <w:tcMar>
+              <w:top w:w="60" w:type="dxa"/>
+              <w:start w:w="95" w:type="dxa"/>
+              <w:bottom w:w="60" w:type="dxa"/>
+              <w:end w:w="95" w:type="dxa"/>
+            </w:tcMar>
+            <w:vAlign w:val="center"/>
+          </w:tcPr>
+          <w:p>
+            <w:r>
+              <w:rPr>
+                <w:color w:val="000000"/>
+              </w:rPr>
+              <w:t>All_Beauty, Grocery_and_Gourmet_Food, Movies_and_TV, Video_Games</w:t>
+            </w:r>
+          </w:p>
+        </w:tc>
+        <w:tc>
+          <w:tcPr>
+            <w:tcW w:type="dxa" w:w="4248"/>
+            <w:tcMar>
+              <w:top w:w="60" w:type="dxa"/>
+              <w:start w:w="95" w:type="dxa"/>
+              <w:bottom w:w="60" w:type="dxa"/>
+              <w:end w:w="95" w:type="dxa"/>
+            </w:tcMar>
+            <w:vAlign w:val="center"/>
+          </w:tcPr>
+          <w:p>
+            <w:r>
+              <w:rPr>
+                <w:color w:val="000000"/>
+              </w:rPr>
+              <w:t>Beauty, grocery, movies, and games behavior</w:t>
+            </w:r>
+          </w:p>
+        </w:tc>
+      </w:tr>
+      <w:tr>
+        <w:tc>
+          <w:tcPr>
+            <w:tcW w:type="dxa" w:w="1872"/>
+            <w:tcMar>
+              <w:top w:w="60" w:type="dxa"/>
+              <w:start w:w="95" w:type="dxa"/>
+              <w:bottom w:w="60" w:type="dxa"/>
+              <w:end w:w="95" w:type="dxa"/>
+            </w:tcMar>
+            <w:vAlign w:val="center"/>
+          </w:tcPr>
+          <w:p>
+            <w:r>
+              <w:rPr>
+                <w:color w:val="000000"/>
+              </w:rPr>
+              <w:t>Products</w:t>
+            </w:r>
+          </w:p>
+        </w:tc>
+        <w:tc>
+          <w:tcPr>
+            <w:tcW w:type="dxa" w:w="3240"/>
+            <w:tcMar>
+              <w:top w:w="60" w:type="dxa"/>
+              <w:start w:w="95" w:type="dxa"/>
+              <w:bottom w:w="60" w:type="dxa"/>
+              <w:end w:w="95" w:type="dxa"/>
+            </w:tcMar>
+            <w:vAlign w:val="center"/>
+          </w:tcPr>
+          <w:p>
+            <w:r>
+              <w:rPr>
+                <w:color w:val="000000"/>
+              </w:rPr>
+              <w:t>252</w:t>
+            </w:r>
+          </w:p>
+        </w:tc>
+        <w:tc>
+          <w:tcPr>
+            <w:tcW w:type="dxa" w:w="4248"/>
+            <w:tcMar>
+              <w:top w:w="60" w:type="dxa"/>
+              <w:start w:w="95" w:type="dxa"/>
+              <w:bottom w:w="60" w:type="dxa"/>
+              <w:end w:w="95" w:type="dxa"/>
+            </w:tcMar>
+            <w:vAlign w:val="center"/>
+          </w:tcPr>
+          <w:p>
+            <w:r>
+              <w:rPr>
+                <w:color w:val="000000"/>
+              </w:rPr>
+              <w:t>Candidate items available to rating and ranking models</w:t>
+            </w:r>
+          </w:p>
+        </w:tc>
+      </w:tr>
+      <w:tr>
+        <w:tc>
+          <w:tcPr>
+            <w:tcW w:type="dxa" w:w="1872"/>
+            <w:tcMar>
+              <w:top w:w="60" w:type="dxa"/>
+              <w:start w:w="95" w:type="dxa"/>
+              <w:bottom w:w="60" w:type="dxa"/>
+              <w:end w:w="95" w:type="dxa"/>
+            </w:tcMar>
+            <w:vAlign w:val="center"/>
+          </w:tcPr>
+          <w:p>
+            <w:r>
+              <w:rPr>
+                <w:color w:val="000000"/>
+              </w:rPr>
+              <w:t>Reviews</w:t>
+            </w:r>
+          </w:p>
+        </w:tc>
+        <w:tc>
+          <w:tcPr>
+            <w:tcW w:type="dxa" w:w="3240"/>
+            <w:tcMar>
+              <w:top w:w="60" w:type="dxa"/>
+              <w:start w:w="95" w:type="dxa"/>
+              <w:bottom w:w="60" w:type="dxa"/>
+              <w:end w:w="95" w:type="dxa"/>
+            </w:tcMar>
+            <w:vAlign w:val="center"/>
+          </w:tcPr>
+          <w:p>
+            <w:r>
+              <w:rPr>
+                <w:color w:val="000000"/>
+              </w:rPr>
+              <w:t>265</w:t>
+            </w:r>
+          </w:p>
+        </w:tc>
+        <w:tc>
+          <w:tcPr>
+            <w:tcW w:type="dxa" w:w="4248"/>
+            <w:tcMar>
+              <w:top w:w="60" w:type="dxa"/>
+              <w:start w:w="95" w:type="dxa"/>
+              <w:bottom w:w="60" w:type="dxa"/>
+              <w:end w:w="95" w:type="dxa"/>
+            </w:tcMar>
+            <w:vAlign w:val="center"/>
+          </w:tcPr>
+          <w:p>
+            <w:r>
+              <w:rPr>
+                <w:color w:val="000000"/>
+              </w:rPr>
+              <w:t>Real review text and star ratings after filtering</w:t>
+            </w:r>
+          </w:p>
+        </w:tc>
+      </w:tr>
+      <w:tr>
+        <w:tc>
+          <w:tcPr>
+            <w:tcW w:type="dxa" w:w="1872"/>
+            <w:tcMar>
+              <w:top w:w="60" w:type="dxa"/>
+              <w:start w:w="95" w:type="dxa"/>
+              <w:bottom w:w="60" w:type="dxa"/>
+              <w:end w:w="95" w:type="dxa"/>
+            </w:tcMar>
+            <w:vAlign w:val="center"/>
+          </w:tcPr>
+          <w:p>
+            <w:r>
+              <w:rPr>
+                <w:color w:val="000000"/>
+              </w:rPr>
+              <w:t>Users</w:t>
+            </w:r>
+          </w:p>
+        </w:tc>
+        <w:tc>
+          <w:tcPr>
+            <w:tcW w:type="dxa" w:w="3240"/>
+            <w:tcMar>
+              <w:top w:w="60" w:type="dxa"/>
+              <w:start w:w="95" w:type="dxa"/>
+              <w:bottom w:w="60" w:type="dxa"/>
+              <w:end w:w="95" w:type="dxa"/>
+            </w:tcMar>
+            <w:vAlign w:val="center"/>
+          </w:tcPr>
+          <w:p>
+            <w:r>
+              <w:rPr>
+                <w:color w:val="000000"/>
+              </w:rPr>
+              <w:t>70</w:t>
+            </w:r>
+          </w:p>
+        </w:tc>
+        <w:tc>
+          <w:tcPr>
+            <w:tcW w:type="dxa" w:w="4248"/>
+            <w:tcMar>
+              <w:top w:w="60" w:type="dxa"/>
+              <w:start w:w="95" w:type="dxa"/>
+              <w:bottom w:w="60" w:type="dxa"/>
+              <w:end w:w="95" w:type="dxa"/>
+            </w:tcMar>
+            <w:vAlign w:val="center"/>
+          </w:tcPr>
+          <w:p>
+            <w:r>
+              <w:rPr>
+                <w:color w:val="000000"/>
+              </w:rPr>
+              <w:t>Users with chronological interactions</w:t>
+            </w:r>
+          </w:p>
+        </w:tc>
+      </w:tr>
+      <w:tr>
+        <w:tc>
+          <w:tcPr>
+            <w:tcW w:type="dxa" w:w="1872"/>
+            <w:tcMar>
+              <w:top w:w="60" w:type="dxa"/>
+              <w:start w:w="95" w:type="dxa"/>
+              <w:bottom w:w="60" w:type="dxa"/>
+              <w:end w:w="95" w:type="dxa"/>
+            </w:tcMar>
+            <w:vAlign w:val="center"/>
+          </w:tcPr>
+          <w:p>
+            <w:r>
+              <w:rPr>
+                <w:color w:val="000000"/>
+              </w:rPr>
+              <w:t>Holdout</w:t>
+            </w:r>
+          </w:p>
+        </w:tc>
+        <w:tc>
+          <w:tcPr>
+            <w:tcW w:type="dxa" w:w="3240"/>
+            <w:tcMar>
+              <w:top w:w="60" w:type="dxa"/>
+              <w:start w:w="95" w:type="dxa"/>
+              <w:bottom w:w="60" w:type="dxa"/>
+              <w:end w:w="95" w:type="dxa"/>
+            </w:tcMar>
+            <w:vAlign w:val="center"/>
+          </w:tcPr>
+          <w:p>
+            <w:r>
+              <w:rPr>
+                <w:color w:val="000000"/>
+              </w:rPr>
+              <w:t>179 train / 86 test</w:t>
+            </w:r>
+          </w:p>
+        </w:tc>
+        <w:tc>
+          <w:tcPr>
+            <w:tcW w:type="dxa" w:w="4248"/>
+            <w:tcMar>
+              <w:top w:w="60" w:type="dxa"/>
+              <w:start w:w="95" w:type="dxa"/>
+              <w:bottom w:w="60" w:type="dxa"/>
+              <w:end w:w="95" w:type="dxa"/>
+            </w:tcMar>
+            <w:vAlign w:val="center"/>
+          </w:tcPr>
+          <w:p>
+            <w:r>
+              <w:rPr>
+                <w:color w:val="000000"/>
+              </w:rPr>
+              <w:t>Most recent interaction held out where possible</w:t>
+            </w:r>
+          </w:p>
+        </w:tc>
+      </w:tr>
+    </w:tbl>
+    <w:tbl>
+      <w:tblPr>
+        <w:tblStyle w:val="TableGrid"/>
+        <w:tblW w:type="auto" w:w="0"/>
+        <w:jc w:val="left"/>
+        <w:tblLook w:firstColumn="1" w:firstRow="1" w:lastColumn="0" w:lastRow="0" w:noHBand="0" w:noVBand="1" w:val="04A0"/>
+      </w:tblPr>
+      <w:tblGrid>
+        <w:gridCol w:w="3389"/>
+        <w:gridCol w:w="3389"/>
+        <w:gridCol w:w="3389"/>
+      </w:tblGrid>
+      <w:tr>
+        <w:tc>
+          <w:tcPr>
+            <w:tcW w:type="dxa" w:w="2232"/>
+            <w:shd w:fill="E6E6E6"/>
+            <w:tcMar>
+              <w:top w:w="60" w:type="dxa"/>
+              <w:start w:w="95" w:type="dxa"/>
+              <w:bottom w:w="60" w:type="dxa"/>
+              <w:end w:w="95" w:type="dxa"/>
+            </w:tcMar>
+            <w:vAlign w:val="center"/>
+          </w:tcPr>
+          <w:p>
+            <w:r>
+              <w:rPr>
+                <w:b/>
+                <w:color w:val="000000"/>
+              </w:rPr>
+              <w:t>Experiment</w:t>
+            </w:r>
+          </w:p>
+        </w:tc>
+        <w:tc>
+          <w:tcPr>
+            <w:tcW w:type="dxa" w:w="3744"/>
+            <w:shd w:fill="E6E6E6"/>
+            <w:tcMar>
+              <w:top w:w="60" w:type="dxa"/>
+              <w:start w:w="95" w:type="dxa"/>
+              <w:bottom w:w="60" w:type="dxa"/>
+              <w:end w:w="95" w:type="dxa"/>
+            </w:tcMar>
+            <w:vAlign w:val="center"/>
+          </w:tcPr>
+          <w:p>
+            <w:r>
+              <w:rPr>
+                <w:b/>
+                <w:color w:val="000000"/>
+              </w:rPr>
+              <w:t>Purpose</w:t>
+            </w:r>
+          </w:p>
+        </w:tc>
+        <w:tc>
+          <w:tcPr>
+            <w:tcW w:type="dxa" w:w="3384"/>
+            <w:shd w:fill="E6E6E6"/>
+            <w:tcMar>
+              <w:top w:w="60" w:type="dxa"/>
+              <w:start w:w="95" w:type="dxa"/>
+              <w:bottom w:w="60" w:type="dxa"/>
+              <w:end w:w="95" w:type="dxa"/>
+            </w:tcMar>
+            <w:vAlign w:val="center"/>
+          </w:tcPr>
+          <w:p>
+            <w:r>
+              <w:rPr>
+                <w:b/>
+                <w:color w:val="000000"/>
+              </w:rPr>
+              <w:t>Expected Signal</w:t>
+            </w:r>
+          </w:p>
+        </w:tc>
+      </w:tr>
+      <w:tr>
+        <w:tc>
+          <w:tcPr>
+            <w:tcW w:type="dxa" w:w="2232"/>
+            <w:tcMar>
+              <w:top w:w="60" w:type="dxa"/>
+              <w:start w:w="95" w:type="dxa"/>
+              <w:bottom w:w="60" w:type="dxa"/>
+              <w:end w:w="95" w:type="dxa"/>
+            </w:tcMar>
+            <w:vAlign w:val="center"/>
+          </w:tcPr>
+          <w:p>
+            <w:r>
+              <w:rPr>
+                <w:color w:val="000000"/>
+              </w:rPr>
+              <w:t>Global mean baseline</w:t>
+            </w:r>
+          </w:p>
+        </w:tc>
+        <w:tc>
+          <w:tcPr>
+            <w:tcW w:type="dxa" w:w="3744"/>
+            <w:tcMar>
+              <w:top w:w="60" w:type="dxa"/>
+              <w:start w:w="95" w:type="dxa"/>
+              <w:bottom w:w="60" w:type="dxa"/>
+              <w:end w:w="95" w:type="dxa"/>
+            </w:tcMar>
+            <w:vAlign w:val="center"/>
+          </w:tcPr>
+          <w:p>
+            <w:r>
+              <w:rPr>
+                <w:color w:val="000000"/>
+              </w:rPr>
+              <w:t>Tests whether personalization improves beyond average rating</w:t>
+            </w:r>
+          </w:p>
+        </w:tc>
+        <w:tc>
+          <w:tcPr>
+            <w:tcW w:type="dxa" w:w="3384"/>
+            <w:tcMar>
+              <w:top w:w="60" w:type="dxa"/>
+              <w:start w:w="95" w:type="dxa"/>
+              <w:bottom w:w="60" w:type="dxa"/>
+              <w:end w:w="95" w:type="dxa"/>
+            </w:tcMar>
+            <w:vAlign w:val="center"/>
+          </w:tcPr>
+          <w:p>
+            <w:r>
+              <w:rPr>
+                <w:color w:val="000000"/>
+              </w:rPr>
+              <w:t>Lower RMSE</w:t>
+            </w:r>
+          </w:p>
+        </w:tc>
+      </w:tr>
+      <w:tr>
+        <w:tc>
+          <w:tcPr>
+            <w:tcW w:type="dxa" w:w="2232"/>
+            <w:tcMar>
+              <w:top w:w="60" w:type="dxa"/>
+              <w:start w:w="95" w:type="dxa"/>
+              <w:bottom w:w="60" w:type="dxa"/>
+              <w:end w:w="95" w:type="dxa"/>
+            </w:tcMar>
+            <w:vAlign w:val="center"/>
+          </w:tcPr>
+          <w:p>
+            <w:r>
+              <w:rPr>
+                <w:color w:val="000000"/>
+              </w:rPr>
+              <w:t>Item/category signal</w:t>
+            </w:r>
+          </w:p>
+        </w:tc>
+        <w:tc>
+          <w:tcPr>
+            <w:tcW w:type="dxa" w:w="3744"/>
+            <w:tcMar>
+              <w:top w:w="60" w:type="dxa"/>
+              <w:start w:w="95" w:type="dxa"/>
+              <w:bottom w:w="60" w:type="dxa"/>
+              <w:end w:w="95" w:type="dxa"/>
+            </w:tcMar>
+            <w:vAlign w:val="center"/>
+          </w:tcPr>
+          <w:p>
+            <w:r>
+              <w:rPr>
+                <w:color w:val="000000"/>
+              </w:rPr>
+              <w:t>Checks product and category contribution</w:t>
+            </w:r>
+          </w:p>
+        </w:tc>
+        <w:tc>
+          <w:tcPr>
+            <w:tcW w:type="dxa" w:w="3384"/>
+            <w:tcMar>
+              <w:top w:w="60" w:type="dxa"/>
+              <w:start w:w="95" w:type="dxa"/>
+              <w:bottom w:w="60" w:type="dxa"/>
+              <w:end w:w="95" w:type="dxa"/>
+            </w:tcMar>
+            <w:vAlign w:val="center"/>
+          </w:tcPr>
+          <w:p>
+            <w:r>
+              <w:rPr>
+                <w:color w:val="000000"/>
+              </w:rPr>
+              <w:t>Better fit for unseen items</w:t>
+            </w:r>
+          </w:p>
+        </w:tc>
+      </w:tr>
+      <w:tr>
+        <w:tc>
+          <w:tcPr>
+            <w:tcW w:type="dxa" w:w="2232"/>
+            <w:tcMar>
+              <w:top w:w="60" w:type="dxa"/>
+              <w:start w:w="95" w:type="dxa"/>
+              <w:bottom w:w="60" w:type="dxa"/>
+              <w:end w:w="95" w:type="dxa"/>
+            </w:tcMar>
+            <w:vAlign w:val="center"/>
+          </w:tcPr>
+          <w:p>
+            <w:r>
+              <w:rPr>
+                <w:color w:val="000000"/>
+              </w:rPr>
+              <w:t>No retrieval evidence</w:t>
+            </w:r>
+          </w:p>
+        </w:tc>
+        <w:tc>
+          <w:tcPr>
+            <w:tcW w:type="dxa" w:w="3744"/>
+            <w:tcMar>
+              <w:top w:w="60" w:type="dxa"/>
+              <w:start w:w="95" w:type="dxa"/>
+              <w:bottom w:w="60" w:type="dxa"/>
+              <w:end w:w="95" w:type="dxa"/>
+            </w:tcMar>
+            <w:vAlign w:val="center"/>
+          </w:tcPr>
+          <w:p>
+            <w:r>
+              <w:rPr>
+                <w:color w:val="000000"/>
+              </w:rPr>
+              <w:t>Tests review grounding</w:t>
+            </w:r>
+          </w:p>
+        </w:tc>
+        <w:tc>
+          <w:tcPr>
+            <w:tcW w:type="dxa" w:w="3384"/>
+            <w:tcMar>
+              <w:top w:w="60" w:type="dxa"/>
+              <w:start w:w="95" w:type="dxa"/>
+              <w:bottom w:w="60" w:type="dxa"/>
+              <w:end w:w="95" w:type="dxa"/>
+            </w:tcMar>
+            <w:vAlign w:val="center"/>
+          </w:tcPr>
+          <w:p>
+            <w:r>
+              <w:rPr>
+                <w:color w:val="000000"/>
+              </w:rPr>
+              <w:t>Less specific and less faithful language</w:t>
+            </w:r>
+          </w:p>
+        </w:tc>
+      </w:tr>
+      <w:tr>
+        <w:tc>
+          <w:tcPr>
+            <w:tcW w:type="dxa" w:w="2232"/>
+            <w:tcMar>
+              <w:top w:w="60" w:type="dxa"/>
+              <w:start w:w="95" w:type="dxa"/>
+              <w:bottom w:w="60" w:type="dxa"/>
+              <w:end w:w="95" w:type="dxa"/>
+            </w:tcMar>
+            <w:vAlign w:val="center"/>
+          </w:tcPr>
+          <w:p>
+            <w:r>
+              <w:rPr>
+                <w:color w:val="000000"/>
+              </w:rPr>
+              <w:t>No Groq fallback</w:t>
+            </w:r>
+          </w:p>
+        </w:tc>
+        <w:tc>
+          <w:tcPr>
+            <w:tcW w:type="dxa" w:w="3744"/>
+            <w:tcMar>
+              <w:top w:w="60" w:type="dxa"/>
+              <w:start w:w="95" w:type="dxa"/>
+              <w:bottom w:w="60" w:type="dxa"/>
+              <w:end w:w="95" w:type="dxa"/>
+            </w:tcMar>
+            <w:vAlign w:val="center"/>
+          </w:tcPr>
+          <w:p>
+            <w:r>
+              <w:rPr>
+                <w:color w:val="000000"/>
+              </w:rPr>
+              <w:t>Separates scoring reliability from language fluency</w:t>
+            </w:r>
+          </w:p>
+        </w:tc>
+        <w:tc>
+          <w:tcPr>
+            <w:tcW w:type="dxa" w:w="3384"/>
+            <w:tcMar>
+              <w:top w:w="60" w:type="dxa"/>
+              <w:start w:w="95" w:type="dxa"/>
+              <w:bottom w:w="60" w:type="dxa"/>
+              <w:end w:w="95" w:type="dxa"/>
+            </w:tcMar>
+            <w:vAlign w:val="center"/>
+          </w:tcPr>
+          <w:p>
+            <w:r>
+              <w:rPr>
+                <w:color w:val="000000"/>
+              </w:rPr>
+              <w:t>Runnable but less polished text</w:t>
+            </w:r>
+          </w:p>
+        </w:tc>
+      </w:tr>
+    </w:tbl>
+    <w:p>
+      <w:r>
+        <w:rPr>
+          <w:color w:val="000000"/>
+        </w:rPr>
+        <w:br w:type="page"/>
       </w:r>
     </w:p>
     <w:p>
       <w:pPr>
-        <w:pStyle w:val="Heading2"/>
+        <w:pStyle w:val="Heading1"/>
       </w:pPr>
       <w:r>
         <w:rPr>
           <w:color w:val="000000"/>
         </w:rPr>
-        <w:t>Conclusion</w:t>
+        <w:t>5. Results and Evaluation</w:t>
+      </w:r>
+    </w:p>
+    <w:tbl>
+      <w:tblPr>
+        <w:tblStyle w:val="TableGrid"/>
+        <w:tblW w:type="auto" w:w="0"/>
+        <w:jc w:val="left"/>
+        <w:tblLook w:firstColumn="1" w:firstRow="1" w:lastColumn="0" w:lastRow="0" w:noHBand="0" w:noVBand="1" w:val="04A0"/>
+      </w:tblPr>
+      <w:tblGrid>
+        <w:gridCol w:w="2541"/>
+        <w:gridCol w:w="2541"/>
+        <w:gridCol w:w="2541"/>
+        <w:gridCol w:w="2541"/>
+      </w:tblGrid>
+      <w:tr>
+        <w:tc>
+          <w:tcPr>
+            <w:tcW w:type="dxa" w:w="1800"/>
+            <w:shd w:fill="E6E6E6"/>
+            <w:tcMar>
+              <w:top w:w="60" w:type="dxa"/>
+              <w:start w:w="95" w:type="dxa"/>
+              <w:bottom w:w="60" w:type="dxa"/>
+              <w:end w:w="95" w:type="dxa"/>
+            </w:tcMar>
+            <w:vAlign w:val="center"/>
+          </w:tcPr>
+          <w:p>
+            <w:r>
+              <w:rPr>
+                <w:b/>
+                <w:color w:val="000000"/>
+              </w:rPr>
+              <w:t>Metric</w:t>
+            </w:r>
+          </w:p>
+        </w:tc>
+        <w:tc>
+          <w:tcPr>
+            <w:tcW w:type="dxa" w:w="1800"/>
+            <w:shd w:fill="E6E6E6"/>
+            <w:tcMar>
+              <w:top w:w="60" w:type="dxa"/>
+              <w:start w:w="95" w:type="dxa"/>
+              <w:bottom w:w="60" w:type="dxa"/>
+              <w:end w:w="95" w:type="dxa"/>
+            </w:tcMar>
+            <w:vAlign w:val="center"/>
+          </w:tcPr>
+          <w:p>
+            <w:r>
+              <w:rPr>
+                <w:b/>
+                <w:color w:val="000000"/>
+              </w:rPr>
+              <w:t>Team Ace</w:t>
+            </w:r>
+          </w:p>
+        </w:tc>
+        <w:tc>
+          <w:tcPr>
+            <w:tcW w:type="dxa" w:w="1800"/>
+            <w:shd w:fill="E6E6E6"/>
+            <w:tcMar>
+              <w:top w:w="60" w:type="dxa"/>
+              <w:start w:w="95" w:type="dxa"/>
+              <w:bottom w:w="60" w:type="dxa"/>
+              <w:end w:w="95" w:type="dxa"/>
+            </w:tcMar>
+            <w:vAlign w:val="center"/>
+          </w:tcPr>
+          <w:p>
+            <w:r>
+              <w:rPr>
+                <w:b/>
+                <w:color w:val="000000"/>
+              </w:rPr>
+              <w:t>Baseline</w:t>
+            </w:r>
+          </w:p>
+        </w:tc>
+        <w:tc>
+          <w:tcPr>
+            <w:tcW w:type="dxa" w:w="3960"/>
+            <w:shd w:fill="E6E6E6"/>
+            <w:tcMar>
+              <w:top w:w="60" w:type="dxa"/>
+              <w:start w:w="95" w:type="dxa"/>
+              <w:bottom w:w="60" w:type="dxa"/>
+              <w:end w:w="95" w:type="dxa"/>
+            </w:tcMar>
+            <w:vAlign w:val="center"/>
+          </w:tcPr>
+          <w:p>
+            <w:r>
+              <w:rPr>
+                <w:b/>
+                <w:color w:val="000000"/>
+              </w:rPr>
+              <w:t>Interpretation</w:t>
+            </w:r>
+          </w:p>
+        </w:tc>
+      </w:tr>
+      <w:tr>
+        <w:tc>
+          <w:tcPr>
+            <w:tcW w:type="dxa" w:w="1800"/>
+            <w:tcMar>
+              <w:top w:w="60" w:type="dxa"/>
+              <w:start w:w="95" w:type="dxa"/>
+              <w:bottom w:w="60" w:type="dxa"/>
+              <w:end w:w="95" w:type="dxa"/>
+            </w:tcMar>
+            <w:vAlign w:val="center"/>
+          </w:tcPr>
+          <w:p>
+            <w:r>
+              <w:rPr>
+                <w:color w:val="000000"/>
+              </w:rPr>
+              <w:t>Task A RMSE</w:t>
+            </w:r>
+          </w:p>
+        </w:tc>
+        <w:tc>
+          <w:tcPr>
+            <w:tcW w:type="dxa" w:w="1800"/>
+            <w:tcMar>
+              <w:top w:w="60" w:type="dxa"/>
+              <w:start w:w="95" w:type="dxa"/>
+              <w:bottom w:w="60" w:type="dxa"/>
+              <w:end w:w="95" w:type="dxa"/>
+            </w:tcMar>
+            <w:vAlign w:val="center"/>
+          </w:tcPr>
+          <w:p>
+            <w:r>
+              <w:rPr>
+                <w:color w:val="000000"/>
+              </w:rPr>
+              <w:t>0.7357</w:t>
+            </w:r>
+          </w:p>
+        </w:tc>
+        <w:tc>
+          <w:tcPr>
+            <w:tcW w:type="dxa" w:w="1800"/>
+            <w:tcMar>
+              <w:top w:w="60" w:type="dxa"/>
+              <w:start w:w="95" w:type="dxa"/>
+              <w:bottom w:w="60" w:type="dxa"/>
+              <w:end w:w="95" w:type="dxa"/>
+            </w:tcMar>
+            <w:vAlign w:val="center"/>
+          </w:tcPr>
+          <w:p>
+            <w:r>
+              <w:rPr>
+                <w:color w:val="000000"/>
+              </w:rPr>
+              <w:t>1.3133</w:t>
+            </w:r>
+          </w:p>
+        </w:tc>
+        <w:tc>
+          <w:tcPr>
+            <w:tcW w:type="dxa" w:w="3960"/>
+            <w:tcMar>
+              <w:top w:w="60" w:type="dxa"/>
+              <w:start w:w="95" w:type="dxa"/>
+              <w:bottom w:w="60" w:type="dxa"/>
+              <w:end w:w="95" w:type="dxa"/>
+            </w:tcMar>
+            <w:vAlign w:val="center"/>
+          </w:tcPr>
+          <w:p>
+            <w:r>
+              <w:rPr>
+                <w:color w:val="000000"/>
+              </w:rPr>
+              <w:t>Personalized behavioral features reduce rating error.</w:t>
+            </w:r>
+          </w:p>
+        </w:tc>
+      </w:tr>
+      <w:tr>
+        <w:tc>
+          <w:tcPr>
+            <w:tcW w:type="dxa" w:w="1800"/>
+            <w:tcMar>
+              <w:top w:w="60" w:type="dxa"/>
+              <w:start w:w="95" w:type="dxa"/>
+              <w:bottom w:w="60" w:type="dxa"/>
+              <w:end w:w="95" w:type="dxa"/>
+            </w:tcMar>
+            <w:vAlign w:val="center"/>
+          </w:tcPr>
+          <w:p>
+            <w:r>
+              <w:rPr>
+                <w:color w:val="000000"/>
+              </w:rPr>
+              <w:t>Review quality</w:t>
+            </w:r>
+          </w:p>
+        </w:tc>
+        <w:tc>
+          <w:tcPr>
+            <w:tcW w:type="dxa" w:w="1800"/>
+            <w:tcMar>
+              <w:top w:w="60" w:type="dxa"/>
+              <w:start w:w="95" w:type="dxa"/>
+              <w:bottom w:w="60" w:type="dxa"/>
+              <w:end w:w="95" w:type="dxa"/>
+            </w:tcMar>
+            <w:vAlign w:val="center"/>
+          </w:tcPr>
+          <w:p>
+            <w:r>
+              <w:rPr>
+                <w:color w:val="000000"/>
+              </w:rPr>
+              <w:t>Grounded RAG output</w:t>
+            </w:r>
+          </w:p>
+        </w:tc>
+        <w:tc>
+          <w:tcPr>
+            <w:tcW w:type="dxa" w:w="1800"/>
+            <w:tcMar>
+              <w:top w:w="60" w:type="dxa"/>
+              <w:start w:w="95" w:type="dxa"/>
+              <w:bottom w:w="60" w:type="dxa"/>
+              <w:end w:w="95" w:type="dxa"/>
+            </w:tcMar>
+            <w:vAlign w:val="center"/>
+          </w:tcPr>
+          <w:p>
+            <w:r>
+              <w:rPr>
+                <w:color w:val="000000"/>
+              </w:rPr>
+              <w:t>Generic text</w:t>
+            </w:r>
+          </w:p>
+        </w:tc>
+        <w:tc>
+          <w:tcPr>
+            <w:tcW w:type="dxa" w:w="3960"/>
+            <w:tcMar>
+              <w:top w:w="60" w:type="dxa"/>
+              <w:start w:w="95" w:type="dxa"/>
+              <w:bottom w:w="60" w:type="dxa"/>
+              <w:end w:w="95" w:type="dxa"/>
+            </w:tcMar>
+            <w:vAlign w:val="center"/>
+          </w:tcPr>
+          <w:p>
+            <w:r>
+              <w:rPr>
+                <w:color w:val="000000"/>
+              </w:rPr>
+              <w:t>Review style is conditioned on history, persona, and evidence.</w:t>
+            </w:r>
+          </w:p>
+        </w:tc>
+      </w:tr>
+      <w:tr>
+        <w:tc>
+          <w:tcPr>
+            <w:tcW w:type="dxa" w:w="1800"/>
+            <w:tcMar>
+              <w:top w:w="60" w:type="dxa"/>
+              <w:start w:w="95" w:type="dxa"/>
+              <w:bottom w:w="60" w:type="dxa"/>
+              <w:end w:w="95" w:type="dxa"/>
+            </w:tcMar>
+            <w:vAlign w:val="center"/>
+          </w:tcPr>
+          <w:p>
+            <w:r>
+              <w:rPr>
+                <w:color w:val="000000"/>
+              </w:rPr>
+              <w:t>Fallback</w:t>
+            </w:r>
+          </w:p>
+        </w:tc>
+        <w:tc>
+          <w:tcPr>
+            <w:tcW w:type="dxa" w:w="1800"/>
+            <w:tcMar>
+              <w:top w:w="60" w:type="dxa"/>
+              <w:start w:w="95" w:type="dxa"/>
+              <w:bottom w:w="60" w:type="dxa"/>
+              <w:end w:w="95" w:type="dxa"/>
+            </w:tcMar>
+            <w:vAlign w:val="center"/>
+          </w:tcPr>
+          <w:p>
+            <w:r>
+              <w:rPr>
+                <w:color w:val="000000"/>
+              </w:rPr>
+              <w:t>Supported</w:t>
+            </w:r>
+          </w:p>
+        </w:tc>
+        <w:tc>
+          <w:tcPr>
+            <w:tcW w:type="dxa" w:w="1800"/>
+            <w:tcMar>
+              <w:top w:w="60" w:type="dxa"/>
+              <w:start w:w="95" w:type="dxa"/>
+              <w:bottom w:w="60" w:type="dxa"/>
+              <w:end w:w="95" w:type="dxa"/>
+            </w:tcMar>
+            <w:vAlign w:val="center"/>
+          </w:tcPr>
+          <w:p>
+            <w:r>
+              <w:rPr>
+                <w:color w:val="000000"/>
+              </w:rPr>
+              <w:t>Often absent</w:t>
+            </w:r>
+          </w:p>
+        </w:tc>
+        <w:tc>
+          <w:tcPr>
+            <w:tcW w:type="dxa" w:w="3960"/>
+            <w:tcMar>
+              <w:top w:w="60" w:type="dxa"/>
+              <w:start w:w="95" w:type="dxa"/>
+              <w:bottom w:w="60" w:type="dxa"/>
+              <w:end w:w="95" w:type="dxa"/>
+            </w:tcMar>
+            <w:vAlign w:val="center"/>
+          </w:tcPr>
+          <w:p>
+            <w:r>
+              <w:rPr>
+                <w:color w:val="000000"/>
+              </w:rPr>
+              <w:t>Judges can run the endpoint without paid keys.</w:t>
+            </w:r>
+          </w:p>
+        </w:tc>
+      </w:tr>
+    </w:tbl>
+    <w:p>
+      <w:r>
+        <w:rPr>
+          <w:color w:val="000000"/>
+        </w:rPr>
+        <w:t>The RMSE result matters because it shows that the review simulator is not merely a text demo. The system makes a behavioral prediction before writing. The generated review is then a natural-language expression of the model's decision, not the source of the decision itself.</w:t>
+      </w:r>
+    </w:p>
+    <w:p>
+      <w:pPr>
+        <w:pStyle w:val="Heading1"/>
+      </w:pPr>
+      <w:r>
+        <w:rPr>
+          <w:color w:val="000000"/>
+        </w:rPr>
+        <w:t>6. Nigerian Contextualization</w:t>
+      </w:r>
+    </w:p>
+    <w:tbl>
+      <w:tblPr>
+        <w:tblStyle w:val="TableGrid"/>
+        <w:tblW w:type="auto" w:w="0"/>
+        <w:jc w:val="left"/>
+        <w:tblLook w:firstColumn="1" w:firstRow="1" w:lastColumn="0" w:lastRow="0" w:noHBand="0" w:noVBand="1" w:val="04A0"/>
+      </w:tblPr>
+      <w:tblGrid>
+        <w:gridCol w:w="3389"/>
+        <w:gridCol w:w="3389"/>
+        <w:gridCol w:w="3389"/>
+      </w:tblGrid>
+      <w:tr>
+        <w:tc>
+          <w:tcPr>
+            <w:tcW w:type="dxa" w:w="2232"/>
+            <w:shd w:fill="E6E6E6"/>
+            <w:tcMar>
+              <w:top w:w="60" w:type="dxa"/>
+              <w:start w:w="95" w:type="dxa"/>
+              <w:bottom w:w="60" w:type="dxa"/>
+              <w:end w:w="95" w:type="dxa"/>
+            </w:tcMar>
+            <w:vAlign w:val="center"/>
+          </w:tcPr>
+          <w:p>
+            <w:r>
+              <w:rPr>
+                <w:b/>
+                <w:color w:val="000000"/>
+              </w:rPr>
+              <w:t>Persona</w:t>
+            </w:r>
+          </w:p>
+        </w:tc>
+        <w:tc>
+          <w:tcPr>
+            <w:tcW w:type="dxa" w:w="3168"/>
+            <w:shd w:fill="E6E6E6"/>
+            <w:tcMar>
+              <w:top w:w="60" w:type="dxa"/>
+              <w:start w:w="95" w:type="dxa"/>
+              <w:bottom w:w="60" w:type="dxa"/>
+              <w:end w:w="95" w:type="dxa"/>
+            </w:tcMar>
+            <w:vAlign w:val="center"/>
+          </w:tcPr>
+          <w:p>
+            <w:r>
+              <w:rPr>
+                <w:b/>
+                <w:color w:val="000000"/>
+              </w:rPr>
+              <w:t>Signal</w:t>
+            </w:r>
+          </w:p>
+        </w:tc>
+        <w:tc>
+          <w:tcPr>
+            <w:tcW w:type="dxa" w:w="3960"/>
+            <w:shd w:fill="E6E6E6"/>
+            <w:tcMar>
+              <w:top w:w="60" w:type="dxa"/>
+              <w:start w:w="95" w:type="dxa"/>
+              <w:bottom w:w="60" w:type="dxa"/>
+              <w:end w:w="95" w:type="dxa"/>
+            </w:tcMar>
+            <w:vAlign w:val="center"/>
+          </w:tcPr>
+          <w:p>
+            <w:r>
+              <w:rPr>
+                <w:b/>
+                <w:color w:val="000000"/>
+              </w:rPr>
+              <w:t>Effect on Review</w:t>
+            </w:r>
+          </w:p>
+        </w:tc>
+      </w:tr>
+      <w:tr>
+        <w:tc>
+          <w:tcPr>
+            <w:tcW w:type="dxa" w:w="2232"/>
+            <w:tcMar>
+              <w:top w:w="60" w:type="dxa"/>
+              <w:start w:w="95" w:type="dxa"/>
+              <w:bottom w:w="60" w:type="dxa"/>
+              <w:end w:w="95" w:type="dxa"/>
+            </w:tcMar>
+            <w:vAlign w:val="center"/>
+          </w:tcPr>
+          <w:p>
+            <w:r>
+              <w:rPr>
+                <w:color w:val="000000"/>
+              </w:rPr>
+              <w:t>Lagos student</w:t>
+            </w:r>
+          </w:p>
+        </w:tc>
+        <w:tc>
+          <w:tcPr>
+            <w:tcW w:type="dxa" w:w="3168"/>
+            <w:tcMar>
+              <w:top w:w="60" w:type="dxa"/>
+              <w:start w:w="95" w:type="dxa"/>
+              <w:bottom w:w="60" w:type="dxa"/>
+              <w:end w:w="95" w:type="dxa"/>
+            </w:tcMar>
+            <w:vAlign w:val="center"/>
+          </w:tcPr>
+          <w:p>
+            <w:r>
+              <w:rPr>
+                <w:color w:val="000000"/>
+              </w:rPr>
+              <w:t>Low budget, school routine, transport cost</w:t>
+            </w:r>
+          </w:p>
+        </w:tc>
+        <w:tc>
+          <w:tcPr>
+            <w:tcW w:type="dxa" w:w="3960"/>
+            <w:tcMar>
+              <w:top w:w="60" w:type="dxa"/>
+              <w:start w:w="95" w:type="dxa"/>
+              <w:bottom w:w="60" w:type="dxa"/>
+              <w:end w:w="95" w:type="dxa"/>
+            </w:tcMar>
+            <w:vAlign w:val="center"/>
+          </w:tcPr>
+          <w:p>
+            <w:r>
+              <w:rPr>
+                <w:color w:val="000000"/>
+              </w:rPr>
+              <w:t>More value-sensitive wording and practical tradeoffs</w:t>
+            </w:r>
+          </w:p>
+        </w:tc>
+      </w:tr>
+      <w:tr>
+        <w:tc>
+          <w:tcPr>
+            <w:tcW w:type="dxa" w:w="2232"/>
+            <w:tcMar>
+              <w:top w:w="60" w:type="dxa"/>
+              <w:start w:w="95" w:type="dxa"/>
+              <w:bottom w:w="60" w:type="dxa"/>
+              <w:end w:w="95" w:type="dxa"/>
+            </w:tcMar>
+            <w:vAlign w:val="center"/>
+          </w:tcPr>
+          <w:p>
+            <w:r>
+              <w:rPr>
+                <w:color w:val="000000"/>
+              </w:rPr>
+              <w:t>Abuja professional</w:t>
+            </w:r>
+          </w:p>
+        </w:tc>
+        <w:tc>
+          <w:tcPr>
+            <w:tcW w:type="dxa" w:w="3168"/>
+            <w:tcMar>
+              <w:top w:w="60" w:type="dxa"/>
+              <w:start w:w="95" w:type="dxa"/>
+              <w:bottom w:w="60" w:type="dxa"/>
+              <w:end w:w="95" w:type="dxa"/>
+            </w:tcMar>
+            <w:vAlign w:val="center"/>
+          </w:tcPr>
+          <w:p>
+            <w:r>
+              <w:rPr>
+                <w:color w:val="000000"/>
+              </w:rPr>
+              <w:t>Work routine, heat, polished daily use</w:t>
+            </w:r>
+          </w:p>
+        </w:tc>
+        <w:tc>
+          <w:tcPr>
+            <w:tcW w:type="dxa" w:w="3960"/>
+            <w:tcMar>
+              <w:top w:w="60" w:type="dxa"/>
+              <w:start w:w="95" w:type="dxa"/>
+              <w:bottom w:w="60" w:type="dxa"/>
+              <w:end w:w="95" w:type="dxa"/>
+            </w:tcMar>
+            <w:vAlign w:val="center"/>
+          </w:tcPr>
+          <w:p>
+            <w:r>
+              <w:rPr>
+                <w:color w:val="000000"/>
+              </w:rPr>
+              <w:t>Reliability and presentation become stronger factors</w:t>
+            </w:r>
+          </w:p>
+        </w:tc>
+      </w:tr>
+      <w:tr>
+        <w:tc>
+          <w:tcPr>
+            <w:tcW w:type="dxa" w:w="2232"/>
+            <w:tcMar>
+              <w:top w:w="60" w:type="dxa"/>
+              <w:start w:w="95" w:type="dxa"/>
+              <w:bottom w:w="60" w:type="dxa"/>
+              <w:end w:w="95" w:type="dxa"/>
+            </w:tcMar>
+            <w:vAlign w:val="center"/>
+          </w:tcPr>
+          <w:p>
+            <w:r>
+              <w:rPr>
+                <w:color w:val="000000"/>
+              </w:rPr>
+              <w:t>Port Harcourt family shopper</w:t>
+            </w:r>
+          </w:p>
+        </w:tc>
+        <w:tc>
+          <w:tcPr>
+            <w:tcW w:type="dxa" w:w="3168"/>
+            <w:tcMar>
+              <w:top w:w="60" w:type="dxa"/>
+              <w:start w:w="95" w:type="dxa"/>
+              <w:bottom w:w="60" w:type="dxa"/>
+              <w:end w:w="95" w:type="dxa"/>
+            </w:tcMar>
+            <w:vAlign w:val="center"/>
+          </w:tcPr>
+          <w:p>
+            <w:r>
+              <w:rPr>
+                <w:color w:val="000000"/>
+              </w:rPr>
+              <w:t>Visitors, children, home use</w:t>
+            </w:r>
+          </w:p>
+        </w:tc>
+        <w:tc>
+          <w:tcPr>
+            <w:tcW w:type="dxa" w:w="3960"/>
+            <w:tcMar>
+              <w:top w:w="60" w:type="dxa"/>
+              <w:start w:w="95" w:type="dxa"/>
+              <w:bottom w:w="60" w:type="dxa"/>
+              <w:end w:w="95" w:type="dxa"/>
+            </w:tcMar>
+            <w:vAlign w:val="center"/>
+          </w:tcPr>
+          <w:p>
+            <w:r>
+              <w:rPr>
+                <w:color w:val="000000"/>
+              </w:rPr>
+              <w:t>Family-safe, shareable, gentle, and value-pack reasoning</w:t>
+            </w:r>
+          </w:p>
+        </w:tc>
+      </w:tr>
+    </w:tbl>
+    <w:p>
+      <w:r>
+        <w:rPr>
+          <w:color w:val="000000"/>
+        </w:rPr>
+        <w:t>Yarn Mode and YarnGPT audio are output layers for accessibility and local resonance. They do not change the underlying rating score; they make the explanation easier to present in a Nigerian demo context.</w:t>
+      </w:r>
+    </w:p>
+    <w:p>
+      <w:pPr>
+        <w:pStyle w:val="Heading1"/>
+      </w:pPr>
+      <w:r>
+        <w:rPr>
+          <w:color w:val="000000"/>
+        </w:rPr>
+        <w:t>7. Demo, Reproducibility, and Next Steps</w:t>
+      </w:r>
+    </w:p>
+    <w:p>
+      <w:pPr>
+        <w:pStyle w:val="ListBullet"/>
+        <w:spacing w:after="40"/>
+      </w:pPr>
+      <w:r>
+        <w:rPr>
+          <w:color w:val="000000"/>
+        </w:rPr>
+        <w:t>Standalone deployment: python -m uvicorn app.task_a_main:app --host 0.0.0.0 --port $PORT.</w:t>
+      </w:r>
+    </w:p>
+    <w:p>
+      <w:pPr>
+        <w:pStyle w:val="ListBullet"/>
+        <w:spacing w:after="40"/>
+      </w:pPr>
+      <w:r>
+        <w:rPr>
+          <w:color w:val="000000"/>
+        </w:rPr>
+        <w:t>Local endpoint: POST /api/v1/generate-review.</w:t>
+      </w:r>
+    </w:p>
+    <w:p>
+      <w:pPr>
+        <w:pStyle w:val="ListBullet"/>
+        <w:spacing w:after="40"/>
+      </w:pPr>
+      <w:r>
+        <w:rPr>
+          <w:color w:val="000000"/>
+        </w:rPr>
+        <w:t>Task A UI opens directly at the service root.</w:t>
+      </w:r>
+    </w:p>
+    <w:p>
+      <w:pPr>
+        <w:pStyle w:val="ListBullet"/>
+        <w:spacing w:after="40"/>
+      </w:pPr>
+      <w:r>
+        <w:rPr>
+          <w:color w:val="000000"/>
+        </w:rPr>
+        <w:t>Docker Compose exposes Task A on port 8001.</w:t>
+      </w:r>
+    </w:p>
+    <w:p>
+      <w:pPr>
+        <w:pStyle w:val="ListBullet"/>
+        <w:spacing w:after="40"/>
+      </w:pPr>
+      <w:r>
+        <w:rPr>
+          <w:color w:val="000000"/>
+        </w:rPr>
+        <w:t>Tests verify the split app serves Task A without exposing the Task B endpoint.</w:t>
       </w:r>
     </w:p>
     <w:p>
@@ -1039,15 +2954,35 @@
         <w:rPr>
           <w:color w:val="000000"/>
         </w:rPr>
-        <w:t>Task A demonstrates that review simulation can be both fluent and auditable. Team Ace predicts the behavior first, then lets the LLM speak in the user's voice.</w:t>
+        <w:t>Future work would scale the subset, add embedding retrieval for review evidence, run stronger BERTScore evaluation, and learn calibration parameters from larger user histories.</w:t>
+      </w:r>
+    </w:p>
+    <w:p>
+      <w:pPr>
+        <w:pStyle w:val="Heading1"/>
+      </w:pPr>
+      <w:r>
+        <w:rPr>
+          <w:color w:val="000000"/>
+        </w:rPr>
+        <w:t>Team and Conclusion</w:t>
+      </w:r>
+    </w:p>
+    <w:p>
+      <w:r>
+        <w:rPr>
+          <w:color w:val="000000"/>
+        </w:rPr>
+        <w:t>Team Ace demonstrates that Task A can be fluent, culturally aware, and measurable. The agent predicts behavior first, then speaks in a grounded user voice.</w:t>
       </w:r>
     </w:p>
     <w:sectPr>
       <w:headerReference w:type="default" r:id="rId9"/>
       <w:footerReference w:type="default" r:id="rId10"/>
       <w:pgSz w:w="12240" w:h="15840"/>
-      <w:pgMar w:top="1008" w:right="1080" w:bottom="1008" w:left="1080" w:header="720" w:footer="720" w:gutter="0"/>
+      <w:pgMar w:top="893" w:right="1037" w:bottom="893" w:left="1037" w:header="720" w:footer="720" w:gutter="0"/>
       <w:cols w:space="720"/>
+      <w:titlePg/>
       <w:docGrid w:linePitch="360"/>
     </w:sectPr>
   </w:body>
@@ -1454,13 +3389,13 @@
     <w:qFormat/>
     <w:rsid w:val="00FC693F"/>
     <w:pPr>
-      <w:spacing w:after="60" w:line="240" w:lineRule="auto"/>
+      <w:spacing w:after="50" w:line="240" w:lineRule="auto"/>
     </w:pPr>
     <w:rPr>
       <w:rFonts w:ascii="Arial" w:hAnsi="Arial"/>
       <w:b w:val="0"/>
       <w:color w:val="000000"/>
-      <w:sz w:val="19"/>
+      <w:sz w:val="18"/>
     </w:rPr>
   </w:style>
   <w:style w:type="paragraph" w:styleId="Header">
@@ -1518,7 +3453,7 @@
     <w:pPr>
       <w:keepNext/>
       <w:keepLines/>
-      <w:spacing w:before="480" w:after="60" w:line="240" w:lineRule="auto"/>
+      <w:spacing w:before="480" w:after="50" w:line="240" w:lineRule="auto"/>
       <w:outlineLvl w:val="0"/>
     </w:pPr>
     <w:rPr>
@@ -1526,7 +3461,7 @@
       <w:b/>
       <w:bCs/>
       <w:color w:val="000000"/>
-      <w:sz w:val="28"/>
+      <w:sz w:val="27"/>
       <w:szCs w:val="28"/>
     </w:rPr>
   </w:style>
@@ -1542,7 +3477,7 @@
     <w:pPr>
       <w:keepNext/>
       <w:keepLines/>
-      <w:spacing w:before="200" w:after="60" w:line="240" w:lineRule="auto"/>
+      <w:spacing w:before="200" w:after="50" w:line="240" w:lineRule="auto"/>
       <w:outlineLvl w:val="1"/>
     </w:pPr>
     <w:rPr>
@@ -1550,7 +3485,7 @@
       <w:b/>
       <w:bCs/>
       <w:color w:val="000000"/>
-      <w:sz w:val="24"/>
+      <w:sz w:val="23"/>
       <w:szCs w:val="26"/>
     </w:rPr>
   </w:style>
@@ -1566,14 +3501,15 @@
     <w:pPr>
       <w:keepNext/>
       <w:keepLines/>
-      <w:spacing w:before="200" w:after="0"/>
+      <w:spacing w:before="200" w:after="50" w:line="240" w:lineRule="auto"/>
       <w:outlineLvl w:val="2"/>
     </w:pPr>
     <w:rPr>
-      <w:rFonts w:asciiTheme="majorHAnsi" w:eastAsiaTheme="majorEastAsia" w:hAnsiTheme="majorHAnsi" w:cstheme="majorBidi"/>
+      <w:rFonts w:asciiTheme="majorHAnsi" w:eastAsiaTheme="majorEastAsia" w:hAnsiTheme="majorHAnsi" w:cstheme="majorBidi" w:ascii="Arial" w:hAnsi="Arial"/>
       <w:b/>
       <w:bCs/>
-      <w:color w:val="4F81BD" w:themeColor="accent1"/>
+      <w:color w:val="000000"/>
+      <w:sz w:val="20"/>
     </w:rPr>
   </w:style>
   <w:style w:type="paragraph" w:styleId="Heading4">
@@ -1807,7 +3743,7 @@
       <w:pBdr>
         <w:bottom w:val="single" w:sz="8" w:space="4" w:color="4F81BD" w:themeColor="accent1"/>
       </w:pBdr>
-      <w:spacing w:after="60" w:line="240" w:lineRule="auto"/>
+      <w:spacing w:after="50" w:line="240" w:lineRule="auto"/>
       <w:contextualSpacing/>
     </w:pPr>
     <w:rPr>
@@ -1816,7 +3752,7 @@
       <w:color w:val="000000"/>
       <w:spacing w:val="5"/>
       <w:kern w:val="28"/>
-      <w:sz w:val="42"/>
+      <w:sz w:val="44"/>
       <w:szCs w:val="52"/>
     </w:rPr>
   </w:style>
@@ -1847,7 +3783,7 @@
       <w:numPr>
         <w:ilvl w:val="1"/>
       </w:numPr>
-      <w:spacing w:after="60" w:line="240" w:lineRule="auto"/>
+      <w:spacing w:after="50" w:line="240" w:lineRule="auto"/>
     </w:pPr>
     <w:rPr>
       <w:rFonts w:asciiTheme="majorHAnsi" w:eastAsiaTheme="majorEastAsia" w:hAnsiTheme="majorHAnsi" w:cstheme="majorBidi" w:ascii="Arial" w:hAnsi="Arial"/>
@@ -1856,7 +3792,7 @@
       <w:iCs/>
       <w:color w:val="000000"/>
       <w:spacing w:val="15"/>
-      <w:sz w:val="22"/>
+      <w:sz w:val="21"/>
       <w:szCs w:val="24"/>
     </w:rPr>
   </w:style>

</xml_diff>